<commit_message>
docs: rà soát 897 chính thức toàn văn hồ sơ gửi thẩm định (TB 1056) — sửa 3 Mức 2, 8 Mức 3
Báo cáo 8 phần (DOCX); tác tử ktc897-hieu-luc: 5/5 căn cứ Thông báo khớp chính văn, còn hiệu lực.
Sửa bằng Track Changes (tác giả riêng): hàng bảng BC quá trình lệch cột; 'thay thế danh mục TB 1052'
không có trong QĐ 2119; mã THANG_DIEM lỗi thời; mục lục HD lệch 26 dòng; viện dẫn lần đầu thiếu ngày;
NĐ 334 ghi ngày hiệu lực. BC tiếp thu lần 5 lên bản 2. Hồ sơ vòng 6: 91 tệp, kiem_ho_so sạch.

Co-Authored-By: Claude Opus 5.5 <noreply@anthropic.com>
</commit_message>
<xml_diff>
--- a/30-Ket-Qua/2026-09-29/Ho-So-Tham-Dinh-Vong-6/4-Van-ban/BC_Qua-trinh-xay-dung-bo-cong-cu-KTC-Quan-tri_20260929_v7_TrackChanges.docx
+++ b/30-Ket-Qua/2026-09-29/Ho-So-Tham-Dinh-Vong-6/4-Van-ban/BC_Qua-trinh-xay-dung-bo-cong-cu-KTC-Quan-tri_20260929_v7_TrackChanges.docx
@@ -513,7 +513,35 @@
           <w:sz w:val="28"/>
           <w:szCs w:val="28"/>
         </w:rPr>
-        <w:t>Thực hiện nội dung 1 và nội dung 2 Kế hoạch số 848/KH-CĐKT ngày 03/9/2026 của Trường Cao đẳng Kon Tum phát triển các công cụ trí tuệ nhân tạo hỗ trợ thực hiện nhiệm vụ của các đơn vị thuộc Trường năm 2026, 2027 và Thông báo số 917/TB-CĐKT ngày 10/8/2026 của Trường Cao đẳng Kon Tum; căn cứ Mục 8 Thông báo số 1056/TB-CĐKT ngày 16/9/2026 của Trường Cao đẳng Kon Tum hướng dẫn sử dụng Skill “tao-skill-va-prompt-chuan” để xây dựng các Skill chuyên dụng phục vụ công việc tại các đơn vị thuộc Trường, Phòng TH-HC&amp;QT báo cáo quá trình xây dựng bộ công cụ trí tuệ nhân tạo KTC-Quan-tri (sau đây gọi là Bộ công cụ), cụ thể như sau:</w:t>
+        <w:t xml:space="preserve">Thực hiện nội dung 1 và nội dung 2 Kế hoạch số 848/KH-CĐKT ngày 03/9/2026 của Trường Cao đẳng Kon Tum phát triển các công cụ trí tuệ nhân tạo hỗ trợ thực hiện nhiệm vụ của các đơn vị thuộc Trường năm 2026, 2027 và </w:t>
+      </w:r>
+      <w:del w:id="1017" w:author="Sửa theo rà soát 897 chính thức 29/9 (Claude)" w:date="2026-09-29T18:36:18Z">
+        <w:r>
+          <w:rPr>
+            <w:rFonts w:asciiTheme="majorHAnsi" w:hAnsiTheme="majorHAnsi" w:cstheme="majorHAnsi"/>
+            <w:sz w:val="28"/>
+            <w:szCs w:val="28"/>
+          </w:rPr>
+          <w:delText xml:space="preserve">Thông báo số 917/TB-CĐKT ngày 10/8/2026 của Trường Cao đẳng Kon Tum;</w:delText>
+        </w:r>
+      </w:del>
+      <w:ins w:id="1018" w:author="Sửa theo rà soát 897 chính thức 29/9 (Claude)" w:date="2026-09-29T18:36:18Z">
+        <w:r>
+          <w:rPr>
+            <w:rFonts w:asciiTheme="majorHAnsi" w:hAnsiTheme="majorHAnsi" w:cstheme="majorHAnsi"/>
+            <w:sz w:val="28"/>
+            <w:szCs w:val="28"/>
+          </w:rPr>
+          <w:t xml:space="preserve">Thông báo số 917/TB-CĐKT ngày 10/8/2026 của Trường Cao đẳng Kon Tum kết luận của Bí thư Đảng ủy - Hiệu trưởng nhà trường tại cuộc họp giao ban công tác tuần từ ngày 10/8/2026 đến 16/8/2026;</w:t>
+        </w:r>
+      </w:ins>
+      <w:r>
+        <w:rPr>
+          <w:rFonts w:asciiTheme="majorHAnsi" w:hAnsiTheme="majorHAnsi" w:cstheme="majorHAnsi"/>
+          <w:sz w:val="28"/>
+          <w:szCs w:val="28"/>
+        </w:rPr>
+        <w:t xml:space="preserve"> căn cứ Mục 8 Thông báo số 1056/TB-CĐKT ngày 16/9/2026 của Trường Cao đẳng Kon Tum hướng dẫn sử dụng Skill “tao-skill-va-prompt-chuan” để xây dựng các Skill chuyên dụng phục vụ công việc tại các đơn vị thuộc Trường, Phòng TH-HC&amp;QT báo cáo quá trình xây dựng bộ công cụ trí tuệ nhân tạo KTC-Quan-tri (sau đây gọi là Bộ công cụ), cụ thể như sau:</w:t>
       </w:r>
     </w:p>
     <w:p>
@@ -568,7 +596,63 @@
           <w:sz w:val="28"/>
           <w:szCs w:val="28"/>
         </w:rPr>
-        <w:t>hỗ trợ xây dựng kế hoạch công tác năm, quý, tháng; tổng hợp báo cáo công tác tháng, quý, 6 tháng, năm theo Thông báo số 736/TB-CĐKT và 6 trục kết quả trọng tâm theo Thông báo số 817/TB-CĐKT; theo dõi nhiệm vụ đến khi có kết quả, minh chứng; hỗ trợ viên chức, người lao động lập kế hoạch và tự đánh giá KPI cá nhân theo Quyết định số 1923/QĐ-CĐKT. Mỗi nhiệm vụ gắn một mã nhiệm vụ (Task_ID) dùng xuyên suốt, bảo đảm báo cáo truy ngược được về nhiệm vụ, đơn vị thực hiện và minh chứng.</w:t>
+        <w:t xml:space="preserve">hỗ trợ xây dựng kế hoạch công tác năm, quý, tháng; tổng hợp báo cáo công tác tháng, quý, 6 tháng, năm </w:t>
+      </w:r>
+      <w:del w:id="1001" w:author="Sửa theo rà soát 897 chính thức 29/9 (Claude)" w:date="2026-09-29T18:36:18Z">
+        <w:r>
+          <w:rPr>
+            <w:rFonts w:asciiTheme="majorHAnsi" w:hAnsiTheme="majorHAnsi" w:cstheme="majorHAnsi"/>
+            <w:sz w:val="28"/>
+            <w:szCs w:val="28"/>
+          </w:rPr>
+          <w:delText xml:space="preserve">theo Thông báo số 736/TB-CĐKT và 6 trục kết quả trọng tâm theo Thông báo số 817/TB-CĐKT; theo dõi</w:delText>
+        </w:r>
+      </w:del>
+      <w:ins w:id="1002" w:author="Sửa theo rà soát 897 chính thức 29/9 (Claude)" w:date="2026-09-29T18:36:18Z">
+        <w:r>
+          <w:rPr>
+            <w:rFonts w:asciiTheme="majorHAnsi" w:hAnsiTheme="majorHAnsi" w:cstheme="majorHAnsi"/>
+            <w:sz w:val="28"/>
+            <w:szCs w:val="28"/>
+          </w:rPr>
+          <w:t xml:space="preserve">theo Thông báo số 736/TB-CĐKT ngày 25/6/2026 và 6 trục kết quả trọng tâm theo Thông báo số 817/TB-CĐKT ngày 14/7/2026; theo dõi</w:t>
+        </w:r>
+      </w:ins>
+      <w:r>
+        <w:rPr>
+          <w:rFonts w:asciiTheme="majorHAnsi" w:hAnsiTheme="majorHAnsi" w:cstheme="majorHAnsi"/>
+          <w:sz w:val="28"/>
+          <w:szCs w:val="28"/>
+        </w:rPr>
+        <w:t xml:space="preserve"> nhiệm vụ đến khi có kết quả, minh chứng; hỗ trợ viên chức, người lao động lập kế hoạch và </w:t>
+      </w:r>
+      <w:del w:id="1003" w:author="Sửa theo rà soát 897 chính thức 29/9 (Claude)" w:date="2026-09-29T18:36:18Z">
+        <w:r>
+          <w:rPr>
+            <w:rFonts w:asciiTheme="majorHAnsi" w:hAnsiTheme="majorHAnsi" w:cstheme="majorHAnsi"/>
+            <w:sz w:val="28"/>
+            <w:szCs w:val="28"/>
+          </w:rPr>
+          <w:delText xml:space="preserve">tự đánh giá KPI cá nhân theo Quyết định số 1923/QĐ-CĐKT. Mỗi nhiệm vụ</w:delText>
+        </w:r>
+      </w:del>
+      <w:ins w:id="1004" w:author="Sửa theo rà soát 897 chính thức 29/9 (Claude)" w:date="2026-09-29T18:36:18Z">
+        <w:r>
+          <w:rPr>
+            <w:rFonts w:asciiTheme="majorHAnsi" w:hAnsiTheme="majorHAnsi" w:cstheme="majorHAnsi"/>
+            <w:sz w:val="28"/>
+            <w:szCs w:val="28"/>
+          </w:rPr>
+          <w:t xml:space="preserve">tự đánh giá KPI cá nhân theo Quyết định số 1923/QĐ-CĐKT ngày 30/8/2026. Mỗi nhiệm vụ</w:t>
+        </w:r>
+      </w:ins>
+      <w:r>
+        <w:rPr>
+          <w:rFonts w:asciiTheme="majorHAnsi" w:hAnsiTheme="majorHAnsi" w:cstheme="majorHAnsi"/>
+          <w:sz w:val="28"/>
+          <w:szCs w:val="28"/>
+        </w:rPr>
+        <w:t xml:space="preserve"> gắn một mã nhiệm vụ (Task_ID) dùng xuyên suốt, bảo đảm báo cáo truy ngược được về nhiệm vụ, đơn vị thực hiện và minh chứng.</w:t>
       </w:r>
     </w:p>
     <w:p>
@@ -1402,8 +1486,28 @@
                 <w:sz w:val="28"/>
                 <w:szCs w:val="28"/>
               </w:rPr>
-              <w:t>Bổ sung kỹ năng lập kế hoạch KPI cá nhân theo 6 mẫu nhóm vị trí (Quyết định số 1923/QĐ-CĐKT, Thông báo số 1052/TB-CĐKT)</w:t>
-            </w:r>
+              <w:t xml:space="preserve">Bổ sung kỹ năng lập kế hoạch KPI cá nhân theo 6 mẫu nhóm vị trí </w:t>
+            </w:r>
+            <w:del w:id="1015" w:author="Sửa theo rà soát 897 chính thức 29/9 (Claude)" w:date="2026-09-29T18:36:18Z">
+              <w:r>
+                <w:rPr>
+                  <w:rFonts w:asciiTheme="majorHAnsi" w:hAnsiTheme="majorHAnsi" w:cstheme="majorHAnsi"/>
+                  <w:sz w:val="28"/>
+                  <w:szCs w:val="28"/>
+                </w:rPr>
+                <w:delText xml:space="preserve">(Quyết định số 1923/QĐ-CĐKT, Thông báo số 1052/TB-CĐKT)</w:delText>
+              </w:r>
+            </w:del>
+            <w:ins w:id="1016" w:author="Sửa theo rà soát 897 chính thức 29/9 (Claude)" w:date="2026-09-29T18:36:18Z">
+              <w:r>
+                <w:rPr>
+                  <w:rFonts w:asciiTheme="majorHAnsi" w:hAnsiTheme="majorHAnsi" w:cstheme="majorHAnsi"/>
+                  <w:sz w:val="28"/>
+                  <w:szCs w:val="28"/>
+                </w:rPr>
+                <w:t xml:space="preserve">(Quyết định số 1923/QĐ-CĐKT, Thông báo số 1052/TB-CĐKT ngày 15/9/2026)</w:t>
+              </w:r>
+            </w:ins>
           </w:p>
         </w:tc>
         <w:tc>
@@ -1937,13 +2041,61 @@
                 <w:szCs w:val="28"/>
               </w:rPr>
             </w:pPr>
-            <w:r>
-              <w:rPr>
-                <w:rFonts w:asciiTheme="majorHAnsi" w:hAnsiTheme="majorHAnsi" w:cstheme="majorHAnsi"/>
-                <w:sz w:val="28"/>
-                <w:szCs w:val="28"/>
-              </w:rPr>
-              <w:t xml:space="preserve">Cập nhật theo Quyết định số 2119/QĐ-CĐKT ban hành Danh mục sản phẩm, công việc (thay thế danh mục dự thảo kèm Thông báo số 1052/TB-CĐKT): hệ số quy đổi tra theo từng sản phẩm của Danh mục chính thức; chuẩn phân loại 6 Trục ghi căn cứ Quyết định số 1923/QĐ-CĐKT (Phụ lục I, II) cho cột Điểm chấm, Hệ số quy đổi; sửa thao tác chặn ghi chặn nhầm lệnh chỉ đọc kho; kết nối thư mục đầu vào, đầu ra cho tài khoản thành viên trên Cowork; báo cáo tháng cấp Trường dựng từ bản đã ban hành, đóng vào plugin mọi công cụ dựng báo cáo (khắc phục chạy thử ngày 28/9/2026); plugin tự đủ, không đề nghị thêm thư mục dự án khi dùng trên Cowork; văn bản dựng bằng cách ráp nội dung vào mẫu 03-Templates(1) hoặc sửa văn bản tương tự, đo thể thức ánh xạ bộ quy tắc KTC-Ra-Soat-897</w:t>
+            <w:del w:id="1005" w:author="Sửa theo rà soát 897 chính thức 29/9 (Claude)" w:date="2026-09-29T18:36:18Z">
+              <w:r>
+                <w:rPr>
+                  <w:rFonts w:asciiTheme="majorHAnsi" w:hAnsiTheme="majorHAnsi" w:cstheme="majorHAnsi"/>
+                  <w:sz w:val="28"/>
+                  <w:szCs w:val="28"/>
+                </w:rPr>
+                <w:delText xml:space="preserve">Cập nhật theo Quyết định số 2119/QĐ-CĐKT ban hành Danh mục</w:delText>
+              </w:r>
+            </w:del>
+            <w:ins w:id="1006" w:author="Sửa theo rà soát 897 chính thức 29/9 (Claude)" w:date="2026-09-29T18:36:18Z">
+              <w:r>
+                <w:rPr>
+                  <w:rFonts w:asciiTheme="majorHAnsi" w:hAnsiTheme="majorHAnsi" w:cstheme="majorHAnsi"/>
+                  <w:sz w:val="28"/>
+                  <w:szCs w:val="28"/>
+                </w:rPr>
+                <w:t xml:space="preserve">Cập nhật theo Quyết định số 2119/QĐ-CĐKT ngày 28/9/2026 ban hành Danh mục</w:t>
+              </w:r>
+            </w:ins>
+            <w:r>
+              <w:rPr>
+                <w:rFonts w:asciiTheme="majorHAnsi" w:hAnsiTheme="majorHAnsi" w:cstheme="majorHAnsi"/>
+                <w:sz w:val="28"/>
+                <w:szCs w:val="28"/>
+              </w:rPr>
+              <w:t xml:space="preserve"> sản phẩm, công việc </w:t>
+            </w:r>
+            <w:del w:id="1013" w:author="Sửa theo rà soát 897 chính thức 29/9 (Claude)" w:date="2026-09-29T18:36:18Z">
+              <w:r>
+                <w:rPr>
+                  <w:rFonts w:asciiTheme="majorHAnsi" w:hAnsiTheme="majorHAnsi" w:cstheme="majorHAnsi"/>
+                  <w:sz w:val="28"/>
+                  <w:szCs w:val="28"/>
+                </w:rPr>
+                <w:delText xml:space="preserve">(thay thế danh mục dự thảo kèm Thông báo số 1052/TB-CĐKT)</w:delText>
+              </w:r>
+            </w:del>
+            <w:ins w:id="1014" w:author="Sửa theo rà soát 897 chính thức 29/9 (Claude)" w:date="2026-09-29T18:36:18Z">
+              <w:r>
+                <w:rPr>
+                  <w:rFonts w:asciiTheme="majorHAnsi" w:hAnsiTheme="majorHAnsi" w:cstheme="majorHAnsi"/>
+                  <w:sz w:val="28"/>
+                  <w:szCs w:val="28"/>
+                </w:rPr>
+                <w:t xml:space="preserve">(Bộ công cụ chuyển từ danh mục dự thảo kèm Thông báo số 1052/TB-CĐKT sang Danh mục chính thức)</w:t>
+              </w:r>
+            </w:ins>
+            <w:r>
+              <w:rPr>
+                <w:rFonts w:asciiTheme="majorHAnsi" w:hAnsiTheme="majorHAnsi" w:cstheme="majorHAnsi"/>
+                <w:sz w:val="28"/>
+                <w:szCs w:val="28"/>
+              </w:rPr>
+              <w:t xml:space="preserve">: hệ số quy đổi tra theo từng sản phẩm của Danh mục chính thức; chuẩn phân loại 6 Trục ghi căn cứ Quyết định số 1923/QĐ-CĐKT (Phụ lục I, II) cho cột Điểm chấm, Hệ số quy đổi; sửa thao tác chặn ghi chặn nhầm lệnh chỉ đọc kho; kết nối thư mục đầu vào, đầu ra cho tài khoản thành viên trên Cowork; báo cáo tháng cấp Trường dựng từ bản đã ban hành, đóng vào plugin mọi công cụ dựng báo cáo (khắc phục chạy thử ngày 28/9/2026); plugin tự đủ, không đề nghị thêm thư mục dự án khi dùng trên Cowork; văn bản dựng bằng cách ráp nội dung vào mẫu 03-Templates(1) hoặc sửa văn bản tương tự, đo thể thức ánh xạ bộ quy tắc KTC-Ra-Soat-897</w:t>
             </w:r>
           </w:p>
         </w:tc>
@@ -1962,7 +2114,7 @@
                 <w:szCs w:val="28"/>
               </w:rPr>
             </w:pPr>
-            <w:del w:id="1001" w:author="Tiếp thu thẩm định lần 5, bản 1.3.13 (Claude)" w:date="2026-09-29T16:41:24Z">
+            <w:del w:id="1001" w:author="Tiếp thu thẩm định lần 5, bản 1.3.13 (Claude)" w:date="2026-09-29T18:33:54Z">
               <w:r>
                 <w:rPr>
                   <w:rFonts w:asciiTheme="majorHAnsi" w:hAnsiTheme="majorHAnsi" w:cstheme="majorHAnsi"/>
@@ -1972,7 +2124,7 @@
                 <w:delText xml:space="preserve">Bản 1.3.3 - 1.3.12 (hiện hành), mã SHA-256</w:delText>
               </w:r>
             </w:del>
-            <w:ins w:id="1002" w:author="Tiếp thu thẩm định lần 5, bản 1.3.13 (Claude)" w:date="2026-09-29T16:41:24Z">
+            <w:ins w:id="1002" w:author="Tiếp thu thẩm định lần 5, bản 1.3.13 (Claude)" w:date="2026-09-29T18:33:54Z">
               <w:r>
                 <w:rPr>
                   <w:rFonts w:asciiTheme="majorHAnsi" w:hAnsiTheme="majorHAnsi" w:cstheme="majorHAnsi"/>
@@ -2021,7 +2173,7 @@
       <w:tr>
         <w:trPr>
           <w:jc w:val="center"/>
-          <w:ins w:id="1003" w:author="Tiếp thu thẩm định lần 5, bản 1.3.13 (Claude)" w:date="2026-09-29T16:41:24Z"/>
+          <w:ins w:id="1003" w:author="Tiếp thu thẩm định lần 5, bản 1.3.13 (Claude)" w:date="2026-09-29T18:33:54Z"/>
         </w:trPr>
         <w:tc>
           <w:tcPr>
@@ -2033,20 +2185,20 @@
               <w:widowControl w:val="0"/>
               <w:jc w:val="center"/>
               <w:rPr>
-                <w:ins w:id="1005" w:author="Tiếp thu thẩm định lần 5, bản 1.3.13 (Claude)" w:date="2026-09-29T16:41:24Z"/>
-                <w:rFonts w:asciiTheme="majorHAnsi" w:hAnsiTheme="majorHAnsi" w:cstheme="majorHAnsi"/>
-                <w:sz w:val="28"/>
-                <w:szCs w:val="28"/>
-              </w:rPr>
-            </w:pPr>
-            <w:ins w:id="1004" w:author="Tiếp thu thẩm định lần 5, bản 1.3.13 (Claude)" w:date="2026-09-29T16:41:24Z">
+                <w:ins w:id="1005" w:author="Tiếp thu thẩm định lần 5, bản 1.3.13 (Claude)" w:date="2026-09-29T18:33:54Z"/>
+                <w:rFonts w:asciiTheme="majorHAnsi" w:hAnsiTheme="majorHAnsi" w:cstheme="majorHAnsi"/>
+                <w:sz w:val="28"/>
+                <w:szCs w:val="28"/>
+              </w:rPr>
+            </w:pPr>
+            <w:ins w:id="1004" w:author="Tiếp thu thẩm định lần 5, bản 1.3.13 (Claude)" w:date="2026-09-29T18:33:54Z">
               <w:r>
                 <w:rPr>
                   <w:rFonts w:asciiTheme="majorHAnsi" w:hAnsiTheme="majorHAnsi" w:cstheme="majorHAnsi"/>
                   <w:sz w:val="28"/>
                   <w:szCs w:val="28"/>
                 </w:rPr>
-                <w:t xml:space="preserve">Bản 1.3.13 (hiện hành), mã SHA-256 d7c34a51...dd7e, mã nguồn commit 16215a8 (nhãn v1.3.13): dựng lại được từ mã nguồn, nội dung chức năng giống 1.3.12; hồ sơ bằng chứng kiểm thử</w:t>
+                <w:t xml:space="preserve">12</w:t>
               </w:r>
             </w:ins>
           </w:p>
@@ -2061,13 +2213,69 @@
               <w:widowControl w:val="0"/>
               <w:jc w:val="both"/>
               <w:rPr>
-                <w:ins w:id="1007" w:author="Tiếp thu thẩm định lần 5, bản 1.3.13 (Claude)" w:date="2026-09-29T16:41:24Z"/>
-                <w:rFonts w:asciiTheme="majorHAnsi" w:hAnsiTheme="majorHAnsi" w:cstheme="majorHAnsi"/>
-                <w:sz w:val="28"/>
-                <w:szCs w:val="28"/>
-              </w:rPr>
-            </w:pPr>
-            <w:ins w:id="1006" w:author="Tiếp thu thẩm định lần 5, bản 1.3.13 (Claude)" w:date="2026-09-29T16:41:24Z">
+                <w:ins w:id="1007" w:author="Tiếp thu thẩm định lần 5, bản 1.3.13 (Claude)" w:date="2026-09-29T18:33:54Z"/>
+                <w:rFonts w:asciiTheme="majorHAnsi" w:hAnsiTheme="majorHAnsi" w:cstheme="majorHAnsi"/>
+                <w:sz w:val="28"/>
+                <w:szCs w:val="28"/>
+              </w:rPr>
+            </w:pPr>
+            <w:ins w:id="1006" w:author="Tiếp thu thẩm định lần 5, bản 1.3.13 (Claude)" w:date="2026-09-29T18:33:54Z">
+              <w:r>
+                <w:rPr>
+                  <w:rFonts w:asciiTheme="majorHAnsi" w:hAnsiTheme="majorHAnsi" w:cstheme="majorHAnsi"/>
+                  <w:sz w:val="28"/>
+                  <w:szCs w:val="28"/>
+                </w:rPr>
+                <w:t xml:space="preserve">Tiếp thu thẩm định độc lập lần 5: dựng lại tệp phát hành từ mã nguồn (chuẩn hóa ký tự xuống dòng); nghiệm thu 15 ca trên chính tệp phát hành, 03 ca trên mô hình khác; thử kịch bản ghi che giấu vào kho</w:t>
+              </w:r>
+            </w:ins>
+          </w:p>
+        </w:tc>
+        <w:tc>
+          <w:tcPr>
+            <w:tcW w:w="3600" w:type="dxa"/>
+            <w:vAlign w:val="center"/>
+          </w:tcPr>
+          <w:p>
+            <w:pPr>
+              <w:widowControl w:val="0"/>
+              <w:jc w:val="both"/>
+              <w:rPr>
+                <w:ins w:id="1009" w:author="Tiếp thu thẩm định lần 5, bản 1.3.13 (Claude)" w:date="2026-09-29T18:33:54Z"/>
+                <w:rFonts w:asciiTheme="majorHAnsi" w:hAnsiTheme="majorHAnsi" w:cstheme="majorHAnsi"/>
+                <w:sz w:val="28"/>
+                <w:szCs w:val="28"/>
+              </w:rPr>
+            </w:pPr>
+            <w:ins w:id="1008" w:author="Tiếp thu thẩm định lần 5, bản 1.3.13 (Claude)" w:date="2026-09-29T18:33:54Z">
+              <w:r>
+                <w:rPr>
+                  <w:rFonts w:asciiTheme="majorHAnsi" w:hAnsiTheme="majorHAnsi" w:cstheme="majorHAnsi"/>
+                  <w:sz w:val="28"/>
+                  <w:szCs w:val="28"/>
+                </w:rPr>
+                <w:t xml:space="preserve">Bản 1.3.13 (hiện hành), mã SHA-256 d7c34a51...dd7e, mã nguồn commit 16215a8 (nhãn v1.3.13), nội dung chức năng giống 1.3.12; hồ sơ bằng chứng kiểm thử</w:t>
+              </w:r>
+            </w:ins>
+          </w:p>
+        </w:tc>
+        <w:tc>
+          <w:tcPr>
+            <w:tcW w:w="1163" w:type="dxa"/>
+            <w:vAlign w:val="center"/>
+          </w:tcPr>
+          <w:p>
+            <w:pPr>
+              <w:widowControl w:val="0"/>
+              <w:jc w:val="center"/>
+              <w:rPr>
+                <w:ins w:id="1011" w:author="Tiếp thu thẩm định lần 5, bản 1.3.13 (Claude)" w:date="2026-09-29T18:33:54Z"/>
+                <w:rFonts w:asciiTheme="majorHAnsi" w:hAnsiTheme="majorHAnsi" w:cstheme="majorHAnsi"/>
+                <w:sz w:val="28"/>
+                <w:szCs w:val="28"/>
+              </w:rPr>
+            </w:pPr>
+            <w:ins w:id="1010" w:author="Tiếp thu thẩm định lần 5, bản 1.3.13 (Claude)" w:date="2026-09-29T18:33:54Z">
               <w:r>
                 <w:rPr>
                   <w:rFonts w:asciiTheme="majorHAnsi" w:hAnsiTheme="majorHAnsi" w:cstheme="majorHAnsi"/>
@@ -2077,76 +2285,6 @@
                 <w:t xml:space="preserve">29/9/2026</w:t>
               </w:r>
             </w:ins>
-          </w:p>
-        </w:tc>
-        <w:tc>
-          <w:tcPr>
-            <w:tcW w:w="3600" w:type="dxa"/>
-            <w:vAlign w:val="center"/>
-          </w:tcPr>
-          <w:p>
-            <w:pPr>
-              <w:widowControl w:val="0"/>
-              <w:jc w:val="both"/>
-              <w:rPr>
-                <w:rFonts w:asciiTheme="majorHAnsi" w:hAnsiTheme="majorHAnsi" w:cstheme="majorHAnsi"/>
-                <w:sz w:val="28"/>
-                <w:szCs w:val="28"/>
-              </w:rPr>
-            </w:pPr>
-            <w:del w:id="1001" w:author="Tiếp thu thẩm định lần 5, bản 1.3.13 (Claude)" w:date="2026-09-29T16:41:24Z">
-              <w:r>
-                <w:rPr>
-                  <w:rFonts w:asciiTheme="majorHAnsi" w:hAnsiTheme="majorHAnsi" w:cstheme="majorHAnsi"/>
-                  <w:sz w:val="28"/>
-                  <w:szCs w:val="28"/>
-                </w:rPr>
-                <w:delText xml:space="preserve">Bản 1.3.3 - 1.3.12 (hiện hành), mã SHA-256</w:delText>
-              </w:r>
-            </w:del>
-            <w:ins w:id="1002" w:author="Tiếp thu thẩm định lần 5, bản 1.3.13 (Claude)" w:date="2026-09-29T16:41:24Z">
-              <w:r>
-                <w:rPr>
-                  <w:rFonts w:asciiTheme="majorHAnsi" w:hAnsiTheme="majorHAnsi" w:cstheme="majorHAnsi"/>
-                  <w:sz w:val="28"/>
-                  <w:szCs w:val="28"/>
-                </w:rPr>
-                <w:t xml:space="preserve">Bản 1.3.3 - 1.3.12, mã SHA-256</w:t>
-              </w:r>
-            </w:ins>
-            <w:r>
-              <w:rPr>
-                <w:rFonts w:asciiTheme="majorHAnsi" w:hAnsiTheme="majorHAnsi" w:cstheme="majorHAnsi"/>
-                <w:sz w:val="28"/>
-                <w:szCs w:val="28"/>
-              </w:rPr>
-              <w:t xml:space="preserve"> ac180420...69df, mã nguồn commit 5d98f2b; hồ sơ bằng chứng kiểm thử</w:t>
-            </w:r>
-          </w:p>
-        </w:tc>
-        <w:tc>
-          <w:tcPr>
-            <w:tcW w:w="1163" w:type="dxa"/>
-            <w:vAlign w:val="center"/>
-          </w:tcPr>
-          <w:p>
-            <w:pPr>
-              <w:widowControl w:val="0"/>
-              <w:jc w:val="center"/>
-              <w:rPr>
-                <w:rFonts w:asciiTheme="majorHAnsi" w:hAnsiTheme="majorHAnsi" w:cstheme="majorHAnsi"/>
-                <w:sz w:val="28"/>
-                <w:szCs w:val="28"/>
-              </w:rPr>
-            </w:pPr>
-            <w:r>
-              <w:rPr>
-                <w:rFonts w:asciiTheme="majorHAnsi" w:hAnsiTheme="majorHAnsi" w:cstheme="majorHAnsi"/>
-                <w:sz w:val="28"/>
-                <w:szCs w:val="28"/>
-              </w:rPr>
-              <w:t xml:space="preserve">28 - 29/9/2026</w:t>
-            </w:r>
           </w:p>
         </w:tc>
       </w:tr>
@@ -2170,7 +2308,7 @@
         </w:rPr>
         <w:t xml:space="preserve">Toàn bộ quá trình được lưu vết: </w:t>
       </w:r>
-      <w:del w:id="1008" w:author="Tiếp thu thẩm định lần 5, bản 1.3.13 (Claude)" w:date="2026-09-29T16:41:24Z">
+      <w:del w:id="1012" w:author="Tiếp thu thẩm định lần 5, bản 1.3.13 (Claude)" w:date="2026-09-29T18:33:54Z">
         <w:r>
           <w:rPr>
             <w:rFonts w:asciiTheme="majorHAnsi" w:hAnsiTheme="majorHAnsi" w:cstheme="majorHAnsi"/>
@@ -2180,14 +2318,34 @@
           <w:delText xml:space="preserve">116 lần cập nhật trên kho mã nguồn (từ 18/9/2026), nhật ký thay đổi 38 phiên bản, 30</w:delText>
         </w:r>
       </w:del>
-      <w:ins w:id="1009" w:author="Tiếp thu thẩm định lần 5, bản 1.3.13 (Claude)" w:date="2026-09-29T16:41:24Z">
+      <w:del w:id="1013" w:author="Tiếp thu thẩm định lần 5, bản 1.3.13 (Claude)" w:date="2026-09-29T18:33:54Z">
         <w:r>
           <w:rPr>
             <w:rFonts w:asciiTheme="majorHAnsi" w:hAnsiTheme="majorHAnsi" w:cstheme="majorHAnsi"/>
             <w:sz w:val="28"/>
             <w:szCs w:val="28"/>
           </w:rPr>
-          <w:t xml:space="preserve">118 lần cập nhật trên kho mã nguồn (từ 18/9/2026), nhật ký thay đổi 39 phiên bản, 30</w:t>
+          <w:delText xml:space="preserve"> biên bản</w:delText>
+        </w:r>
+      </w:del>
+      <w:del w:id="1014" w:author="Tiếp thu thẩm định lần 5, bản 1.3.13 (Claude)" w:date="2026-09-29T18:33:54Z">
+        <w:r>
+          <w:rPr>
+            <w:rFonts w:asciiTheme="majorHAnsi" w:hAnsiTheme="majorHAnsi" w:cstheme="majorHAnsi"/>
+            <w:sz w:val="28"/>
+            <w:szCs w:val="28"/>
+          </w:rPr>
+          <w:delText xml:space="preserve"> quyết định kỹ thuật, 10</w:delText>
+        </w:r>
+      </w:del>
+      <w:ins w:id="1015" w:author="Tiếp thu thẩm định lần 5, bản 1.3.13 (Claude)" w:date="2026-09-29T18:33:54Z">
+        <w:r>
+          <w:rPr>
+            <w:rFonts w:asciiTheme="majorHAnsi" w:hAnsiTheme="majorHAnsi" w:cstheme="majorHAnsi"/>
+            <w:sz w:val="28"/>
+            <w:szCs w:val="28"/>
+          </w:rPr>
+          <w:t xml:space="preserve">119 lần cập nhật trên kho mã nguồn (từ 18/9/2026), nhật ký thay đổi 39 phiên bản, 30 biên bản quyết định kỹ thuật, 12</w:t>
         </w:r>
       </w:ins>
       <w:r>
@@ -2196,15 +2354,7 @@
           <w:sz w:val="28"/>
           <w:szCs w:val="28"/>
         </w:rPr>
-        <w:t xml:space="preserve"> biên bản</w:t>
-      </w:r>
-      <w:r>
-        <w:rPr>
-          <w:rFonts w:asciiTheme="majorHAnsi" w:hAnsiTheme="majorHAnsi" w:cstheme="majorHAnsi"/>
-          <w:sz w:val="28"/>
-          <w:szCs w:val="28"/>
-        </w:rPr>
-        <w:t xml:space="preserve"> quyết định kỹ thuật, 10 bản ghi kinh nghiệm quá trình (Process Memory).</w:t>
+        <w:t xml:space="preserve"> bản ghi kinh nghiệm quá trình (Process Memory).</w:t>
       </w:r>
     </w:p>
     <w:p>
@@ -3244,7 +3394,7 @@
           <w:szCs w:val="28"/>
         </w:rPr>
       </w:pPr>
-      <w:del w:id="1010" w:author="Tiếp thu thẩm định lần 5, bản 1.3.13 (Claude)" w:date="2026-09-29T16:41:24Z">
+      <w:del w:id="1016" w:author="Tiếp thu thẩm định lần 5, bản 1.3.13 (Claude)" w:date="2026-09-29T18:33:54Z">
         <w:r>
           <w:rPr>
             <w:rFonts w:asciiTheme="majorHAnsi" w:hAnsiTheme="majorHAnsi" w:cstheme="majorHAnsi"/>
@@ -3256,7 +3406,7 @@
           <w:delText xml:space="preserve">4. Kết quả kiểm thử (chạy lại ngày 29/9/2026, bản 1.3.12)</w:delText>
         </w:r>
       </w:del>
-      <w:ins w:id="1011" w:author="Tiếp thu thẩm định lần 5, bản 1.3.13 (Claude)" w:date="2026-09-29T16:41:24Z">
+      <w:ins w:id="1017" w:author="Tiếp thu thẩm định lần 5, bản 1.3.13 (Claude)" w:date="2026-09-29T18:33:54Z">
         <w:r>
           <w:rPr>
             <w:rFonts w:asciiTheme="majorHAnsi" w:hAnsiTheme="majorHAnsi" w:cstheme="majorHAnsi"/>
@@ -3559,7 +3709,7 @@
                 <w:szCs w:val="28"/>
               </w:rPr>
             </w:pPr>
-            <w:del w:id="1012" w:author="Tiếp thu thẩm định lần 5, bản 1.3.13 (Claude)" w:date="2026-09-29T16:41:24Z">
+            <w:del w:id="1018" w:author="Tiếp thu thẩm định lần 5, bản 1.3.13 (Claude)" w:date="2026-09-29T18:33:54Z">
               <w:r>
                 <w:rPr>
                   <w:rFonts w:asciiTheme="majorHAnsi" w:hAnsiTheme="majorHAnsi" w:cstheme="majorHAnsi"/>
@@ -3569,7 +3719,7 @@
                 <w:delText xml:space="preserve">24 bộ ca thử hồi quy (plugin tự đủ,</w:delText>
               </w:r>
             </w:del>
-            <w:ins w:id="1013" w:author="Tiếp thu thẩm định lần 5, bản 1.3.13 (Claude)" w:date="2026-09-29T16:41:24Z">
+            <w:ins w:id="1019" w:author="Tiếp thu thẩm định lần 5, bản 1.3.13 (Claude)" w:date="2026-09-29T18:33:54Z">
               <w:r>
                 <w:rPr>
                   <w:rFonts w:asciiTheme="majorHAnsi" w:hAnsiTheme="majorHAnsi" w:cstheme="majorHAnsi"/>
@@ -3661,7 +3811,7 @@
                 <w:szCs w:val="28"/>
               </w:rPr>
             </w:pPr>
-            <w:del w:id="1014" w:author="Tiếp thu thẩm định lần 5, bản 1.3.13 (Claude)" w:date="2026-09-29T16:41:24Z">
+            <w:del w:id="1020" w:author="Tiếp thu thẩm định lần 5, bản 1.3.13 (Claude)" w:date="2026-09-29T18:33:54Z">
               <w:r>
                 <w:rPr>
                   <w:rFonts w:asciiTheme="majorHAnsi" w:hAnsiTheme="majorHAnsi" w:cstheme="majorHAnsi"/>
@@ -3671,7 +3821,7 @@
                 <w:delText xml:space="preserve">24/24 đạt</w:delText>
               </w:r>
             </w:del>
-            <w:ins w:id="1015" w:author="Tiếp thu thẩm định lần 5, bản 1.3.13 (Claude)" w:date="2026-09-29T16:41:24Z">
+            <w:ins w:id="1021" w:author="Tiếp thu thẩm định lần 5, bản 1.3.13 (Claude)" w:date="2026-09-29T18:33:54Z">
               <w:r>
                 <w:rPr>
                   <w:rFonts w:asciiTheme="majorHAnsi" w:hAnsiTheme="majorHAnsi" w:cstheme="majorHAnsi"/>
@@ -4963,7 +5113,7 @@
       <w:tr>
         <w:trPr>
           <w:jc w:val="center"/>
-          <w:ins w:id="1016" w:author="Tiếp thu thẩm định lần 5, bản 1.3.13 (Claude)" w:date="2026-09-29T16:41:24Z"/>
+          <w:ins w:id="1022" w:author="Tiếp thu thẩm định lần 5, bản 1.3.13 (Claude)" w:date="2026-09-29T18:33:54Z"/>
         </w:trPr>
         <w:tc>
           <w:tcPr>
@@ -4975,13 +5125,13 @@
               <w:widowControl w:val="0"/>
               <w:jc w:val="center"/>
               <w:rPr>
-                <w:ins w:id="1018" w:author="Tiếp thu thẩm định lần 5, bản 1.3.13 (Claude)" w:date="2026-09-29T16:41:24Z"/>
-                <w:rFonts w:asciiTheme="majorHAnsi" w:hAnsiTheme="majorHAnsi" w:cstheme="majorHAnsi"/>
-                <w:sz w:val="28"/>
-                <w:szCs w:val="28"/>
-              </w:rPr>
-            </w:pPr>
-            <w:ins w:id="1017" w:author="Tiếp thu thẩm định lần 5, bản 1.3.13 (Claude)" w:date="2026-09-29T16:41:24Z">
+                <w:ins w:id="1024" w:author="Tiếp thu thẩm định lần 5, bản 1.3.13 (Claude)" w:date="2026-09-29T18:33:54Z"/>
+                <w:rFonts w:asciiTheme="majorHAnsi" w:hAnsiTheme="majorHAnsi" w:cstheme="majorHAnsi"/>
+                <w:sz w:val="28"/>
+                <w:szCs w:val="28"/>
+              </w:rPr>
+            </w:pPr>
+            <w:ins w:id="1023" w:author="Tiếp thu thẩm định lần 5, bản 1.3.13 (Claude)" w:date="2026-09-29T18:33:54Z">
               <w:r>
                 <w:rPr>
                   <w:rFonts w:asciiTheme="majorHAnsi" w:hAnsiTheme="majorHAnsi" w:cstheme="majorHAnsi"/>
@@ -5003,13 +5153,13 @@
               <w:widowControl w:val="0"/>
               <w:jc w:val="both"/>
               <w:rPr>
-                <w:ins w:id="1020" w:author="Tiếp thu thẩm định lần 5, bản 1.3.13 (Claude)" w:date="2026-09-29T16:41:24Z"/>
-                <w:rFonts w:asciiTheme="majorHAnsi" w:hAnsiTheme="majorHAnsi" w:cstheme="majorHAnsi"/>
-                <w:sz w:val="28"/>
-                <w:szCs w:val="28"/>
-              </w:rPr>
-            </w:pPr>
-            <w:ins w:id="1019" w:author="Tiếp thu thẩm định lần 5, bản 1.3.13 (Claude)" w:date="2026-09-29T16:41:24Z">
+                <w:ins w:id="1026" w:author="Tiếp thu thẩm định lần 5, bản 1.3.13 (Claude)" w:date="2026-09-29T18:33:54Z"/>
+                <w:rFonts w:asciiTheme="majorHAnsi" w:hAnsiTheme="majorHAnsi" w:cstheme="majorHAnsi"/>
+                <w:sz w:val="28"/>
+                <w:szCs w:val="28"/>
+              </w:rPr>
+            </w:pPr>
+            <w:ins w:id="1025" w:author="Tiếp thu thẩm định lần 5, bản 1.3.13 (Claude)" w:date="2026-09-29T18:33:54Z">
               <w:r>
                 <w:rPr>
                   <w:rFonts w:asciiTheme="majorHAnsi" w:hAnsiTheme="majorHAnsi" w:cstheme="majorHAnsi"/>
@@ -5031,13 +5181,13 @@
               <w:widowControl w:val="0"/>
               <w:jc w:val="both"/>
               <w:rPr>
-                <w:ins w:id="1022" w:author="Tiếp thu thẩm định lần 5, bản 1.3.13 (Claude)" w:date="2026-09-29T16:41:24Z"/>
-                <w:rFonts w:asciiTheme="majorHAnsi" w:hAnsiTheme="majorHAnsi" w:cstheme="majorHAnsi"/>
-                <w:sz w:val="28"/>
-                <w:szCs w:val="28"/>
-              </w:rPr>
-            </w:pPr>
-            <w:ins w:id="1021" w:author="Tiếp thu thẩm định lần 5, bản 1.3.13 (Claude)" w:date="2026-09-29T16:41:24Z">
+                <w:ins w:id="1028" w:author="Tiếp thu thẩm định lần 5, bản 1.3.13 (Claude)" w:date="2026-09-29T18:33:54Z"/>
+                <w:rFonts w:asciiTheme="majorHAnsi" w:hAnsiTheme="majorHAnsi" w:cstheme="majorHAnsi"/>
+                <w:sz w:val="28"/>
+                <w:szCs w:val="28"/>
+              </w:rPr>
+            </w:pPr>
+            <w:ins w:id="1027" w:author="Tiếp thu thẩm định lần 5, bản 1.3.13 (Claude)" w:date="2026-09-29T18:33:54Z">
               <w:r>
                 <w:rPr>
                   <w:rFonts w:asciiTheme="majorHAnsi" w:hAnsiTheme="majorHAnsi" w:cstheme="majorHAnsi"/>
@@ -5059,13 +5209,13 @@
               <w:widowControl w:val="0"/>
               <w:jc w:val="center"/>
               <w:rPr>
-                <w:ins w:id="1024" w:author="Tiếp thu thẩm định lần 5, bản 1.3.13 (Claude)" w:date="2026-09-29T16:41:24Z"/>
-                <w:rFonts w:asciiTheme="majorHAnsi" w:hAnsiTheme="majorHAnsi" w:cstheme="majorHAnsi"/>
-                <w:sz w:val="28"/>
-                <w:szCs w:val="28"/>
-              </w:rPr>
-            </w:pPr>
-            <w:ins w:id="1023" w:author="Tiếp thu thẩm định lần 5, bản 1.3.13 (Claude)" w:date="2026-09-29T16:41:24Z">
+                <w:ins w:id="1030" w:author="Tiếp thu thẩm định lần 5, bản 1.3.13 (Claude)" w:date="2026-09-29T18:33:54Z"/>
+                <w:rFonts w:asciiTheme="majorHAnsi" w:hAnsiTheme="majorHAnsi" w:cstheme="majorHAnsi"/>
+                <w:sz w:val="28"/>
+                <w:szCs w:val="28"/>
+              </w:rPr>
+            </w:pPr>
+            <w:ins w:id="1029" w:author="Tiếp thu thẩm định lần 5, bản 1.3.13 (Claude)" w:date="2026-09-29T18:33:54Z">
               <w:r>
                 <w:rPr>
                   <w:rFonts w:asciiTheme="majorHAnsi" w:hAnsiTheme="majorHAnsi" w:cstheme="majorHAnsi"/>
@@ -5081,7 +5231,7 @@
       <w:tr>
         <w:trPr>
           <w:jc w:val="center"/>
-          <w:ins w:id="1025" w:author="Tiếp thu thẩm định lần 5, bản 1.3.13 (Claude)" w:date="2026-09-29T16:41:24Z"/>
+          <w:ins w:id="1031" w:author="Tiếp thu thẩm định lần 5, bản 1.3.13 (Claude)" w:date="2026-09-29T18:33:54Z"/>
         </w:trPr>
         <w:tc>
           <w:tcPr>
@@ -5093,14 +5243,14 @@
               <w:widowControl w:val="0"/>
               <w:jc w:val="center"/>
               <w:rPr>
-                <w:ins w:id="1027" w:author="Tiếp thu thẩm định lần 5, bản 1.3.13 (Claude)" w:date="2026-09-29T16:41:24Z"/>
-                <w:ins w:id="1018" w:author="Tiếp thu thẩm định lần 5, bản 1.3.13 (Claude)" w:date="2026-09-29T16:41:24Z"/>
-                <w:rFonts w:asciiTheme="majorHAnsi" w:hAnsiTheme="majorHAnsi" w:cstheme="majorHAnsi"/>
-                <w:sz w:val="28"/>
-                <w:szCs w:val="28"/>
-              </w:rPr>
-            </w:pPr>
-            <w:ins w:id="1026" w:author="Tiếp thu thẩm định lần 5, bản 1.3.13 (Claude)" w:date="2026-09-29T16:41:24Z">
+                <w:ins w:id="1033" w:author="Tiếp thu thẩm định lần 5, bản 1.3.13 (Claude)" w:date="2026-09-29T18:33:54Z"/>
+                <w:ins w:id="1024" w:author="Tiếp thu thẩm định lần 5, bản 1.3.13 (Claude)" w:date="2026-09-29T18:33:54Z"/>
+                <w:rFonts w:asciiTheme="majorHAnsi" w:hAnsiTheme="majorHAnsi" w:cstheme="majorHAnsi"/>
+                <w:sz w:val="28"/>
+                <w:szCs w:val="28"/>
+              </w:rPr>
+            </w:pPr>
+            <w:ins w:id="1032" w:author="Tiếp thu thẩm định lần 5, bản 1.3.13 (Claude)" w:date="2026-09-29T18:33:54Z">
               <w:r>
                 <w:rPr>
                   <w:rFonts w:asciiTheme="majorHAnsi" w:hAnsiTheme="majorHAnsi" w:cstheme="majorHAnsi"/>
@@ -5122,14 +5272,14 @@
               <w:widowControl w:val="0"/>
               <w:jc w:val="both"/>
               <w:rPr>
-                <w:ins w:id="1029" w:author="Tiếp thu thẩm định lần 5, bản 1.3.13 (Claude)" w:date="2026-09-29T16:41:24Z"/>
-                <w:ins w:id="1020" w:author="Tiếp thu thẩm định lần 5, bản 1.3.13 (Claude)" w:date="2026-09-29T16:41:24Z"/>
-                <w:rFonts w:asciiTheme="majorHAnsi" w:hAnsiTheme="majorHAnsi" w:cstheme="majorHAnsi"/>
-                <w:sz w:val="28"/>
-                <w:szCs w:val="28"/>
-              </w:rPr>
-            </w:pPr>
-            <w:ins w:id="1028" w:author="Tiếp thu thẩm định lần 5, bản 1.3.13 (Claude)" w:date="2026-09-29T16:41:24Z">
+                <w:ins w:id="1035" w:author="Tiếp thu thẩm định lần 5, bản 1.3.13 (Claude)" w:date="2026-09-29T18:33:54Z"/>
+                <w:ins w:id="1026" w:author="Tiếp thu thẩm định lần 5, bản 1.3.13 (Claude)" w:date="2026-09-29T18:33:54Z"/>
+                <w:rFonts w:asciiTheme="majorHAnsi" w:hAnsiTheme="majorHAnsi" w:cstheme="majorHAnsi"/>
+                <w:sz w:val="28"/>
+                <w:szCs w:val="28"/>
+              </w:rPr>
+            </w:pPr>
+            <w:ins w:id="1034" w:author="Tiếp thu thẩm định lần 5, bản 1.3.13 (Claude)" w:date="2026-09-29T18:33:54Z">
               <w:r>
                 <w:rPr>
                   <w:rFonts w:asciiTheme="majorHAnsi" w:hAnsiTheme="majorHAnsi" w:cstheme="majorHAnsi"/>
@@ -5151,14 +5301,14 @@
               <w:widowControl w:val="0"/>
               <w:jc w:val="both"/>
               <w:rPr>
-                <w:ins w:id="1031" w:author="Tiếp thu thẩm định lần 5, bản 1.3.13 (Claude)" w:date="2026-09-29T16:41:24Z"/>
-                <w:ins w:id="1022" w:author="Tiếp thu thẩm định lần 5, bản 1.3.13 (Claude)" w:date="2026-09-29T16:41:24Z"/>
-                <w:rFonts w:asciiTheme="majorHAnsi" w:hAnsiTheme="majorHAnsi" w:cstheme="majorHAnsi"/>
-                <w:sz w:val="28"/>
-                <w:szCs w:val="28"/>
-              </w:rPr>
-            </w:pPr>
-            <w:ins w:id="1030" w:author="Tiếp thu thẩm định lần 5, bản 1.3.13 (Claude)" w:date="2026-09-29T16:41:24Z">
+                <w:ins w:id="1037" w:author="Tiếp thu thẩm định lần 5, bản 1.3.13 (Claude)" w:date="2026-09-29T18:33:54Z"/>
+                <w:ins w:id="1028" w:author="Tiếp thu thẩm định lần 5, bản 1.3.13 (Claude)" w:date="2026-09-29T18:33:54Z"/>
+                <w:rFonts w:asciiTheme="majorHAnsi" w:hAnsiTheme="majorHAnsi" w:cstheme="majorHAnsi"/>
+                <w:sz w:val="28"/>
+                <w:szCs w:val="28"/>
+              </w:rPr>
+            </w:pPr>
+            <w:ins w:id="1036" w:author="Tiếp thu thẩm định lần 5, bản 1.3.13 (Claude)" w:date="2026-09-29T18:33:54Z">
               <w:r>
                 <w:rPr>
                   <w:rFonts w:asciiTheme="majorHAnsi" w:hAnsiTheme="majorHAnsi" w:cstheme="majorHAnsi"/>
@@ -5180,14 +5330,14 @@
               <w:widowControl w:val="0"/>
               <w:jc w:val="center"/>
               <w:rPr>
-                <w:ins w:id="1033" w:author="Tiếp thu thẩm định lần 5, bản 1.3.13 (Claude)" w:date="2026-09-29T16:41:24Z"/>
-                <w:ins w:id="1024" w:author="Tiếp thu thẩm định lần 5, bản 1.3.13 (Claude)" w:date="2026-09-29T16:41:24Z"/>
-                <w:rFonts w:asciiTheme="majorHAnsi" w:hAnsiTheme="majorHAnsi" w:cstheme="majorHAnsi"/>
-                <w:sz w:val="28"/>
-                <w:szCs w:val="28"/>
-              </w:rPr>
-            </w:pPr>
-            <w:ins w:id="1032" w:author="Tiếp thu thẩm định lần 5, bản 1.3.13 (Claude)" w:date="2026-09-29T16:41:24Z">
+                <w:ins w:id="1039" w:author="Tiếp thu thẩm định lần 5, bản 1.3.13 (Claude)" w:date="2026-09-29T18:33:54Z"/>
+                <w:ins w:id="1030" w:author="Tiếp thu thẩm định lần 5, bản 1.3.13 (Claude)" w:date="2026-09-29T18:33:54Z"/>
+                <w:rFonts w:asciiTheme="majorHAnsi" w:hAnsiTheme="majorHAnsi" w:cstheme="majorHAnsi"/>
+                <w:sz w:val="28"/>
+                <w:szCs w:val="28"/>
+              </w:rPr>
+            </w:pPr>
+            <w:ins w:id="1038" w:author="Tiếp thu thẩm định lần 5, bản 1.3.13 (Claude)" w:date="2026-09-29T18:33:54Z">
               <w:r>
                 <w:rPr>
                   <w:rFonts w:asciiTheme="majorHAnsi" w:hAnsiTheme="majorHAnsi" w:cstheme="majorHAnsi"/>
@@ -5203,7 +5353,7 @@
       <w:tr>
         <w:trPr>
           <w:jc w:val="center"/>
-          <w:ins w:id="1034" w:author="Tiếp thu thẩm định lần 5, bản 1.3.13 (Claude)" w:date="2026-09-29T16:41:24Z"/>
+          <w:ins w:id="1040" w:author="Tiếp thu thẩm định lần 5, bản 1.3.13 (Claude)" w:date="2026-09-29T18:33:54Z"/>
         </w:trPr>
         <w:tc>
           <w:tcPr>
@@ -5215,15 +5365,15 @@
               <w:widowControl w:val="0"/>
               <w:jc w:val="center"/>
               <w:rPr>
-                <w:ins w:id="1036" w:author="Tiếp thu thẩm định lần 5, bản 1.3.13 (Claude)" w:date="2026-09-29T16:41:24Z"/>
-                <w:ins w:id="1027" w:author="Tiếp thu thẩm định lần 5, bản 1.3.13 (Claude)" w:date="2026-09-29T16:41:24Z"/>
-                <w:ins w:id="1018" w:author="Tiếp thu thẩm định lần 5, bản 1.3.13 (Claude)" w:date="2026-09-29T16:41:24Z"/>
-                <w:rFonts w:asciiTheme="majorHAnsi" w:hAnsiTheme="majorHAnsi" w:cstheme="majorHAnsi"/>
-                <w:sz w:val="28"/>
-                <w:szCs w:val="28"/>
-              </w:rPr>
-            </w:pPr>
-            <w:ins w:id="1035" w:author="Tiếp thu thẩm định lần 5, bản 1.3.13 (Claude)" w:date="2026-09-29T16:41:24Z">
+                <w:ins w:id="1042" w:author="Tiếp thu thẩm định lần 5, bản 1.3.13 (Claude)" w:date="2026-09-29T18:33:54Z"/>
+                <w:ins w:id="1033" w:author="Tiếp thu thẩm định lần 5, bản 1.3.13 (Claude)" w:date="2026-09-29T18:33:54Z"/>
+                <w:ins w:id="1024" w:author="Tiếp thu thẩm định lần 5, bản 1.3.13 (Claude)" w:date="2026-09-29T18:33:54Z"/>
+                <w:rFonts w:asciiTheme="majorHAnsi" w:hAnsiTheme="majorHAnsi" w:cstheme="majorHAnsi"/>
+                <w:sz w:val="28"/>
+                <w:szCs w:val="28"/>
+              </w:rPr>
+            </w:pPr>
+            <w:ins w:id="1041" w:author="Tiếp thu thẩm định lần 5, bản 1.3.13 (Claude)" w:date="2026-09-29T18:33:54Z">
               <w:r>
                 <w:rPr>
                   <w:rFonts w:asciiTheme="majorHAnsi" w:hAnsiTheme="majorHAnsi" w:cstheme="majorHAnsi"/>
@@ -5245,15 +5395,15 @@
               <w:widowControl w:val="0"/>
               <w:jc w:val="both"/>
               <w:rPr>
-                <w:ins w:id="1038" w:author="Tiếp thu thẩm định lần 5, bản 1.3.13 (Claude)" w:date="2026-09-29T16:41:24Z"/>
-                <w:ins w:id="1029" w:author="Tiếp thu thẩm định lần 5, bản 1.3.13 (Claude)" w:date="2026-09-29T16:41:24Z"/>
-                <w:ins w:id="1020" w:author="Tiếp thu thẩm định lần 5, bản 1.3.13 (Claude)" w:date="2026-09-29T16:41:24Z"/>
-                <w:rFonts w:asciiTheme="majorHAnsi" w:hAnsiTheme="majorHAnsi" w:cstheme="majorHAnsi"/>
-                <w:sz w:val="28"/>
-                <w:szCs w:val="28"/>
-              </w:rPr>
-            </w:pPr>
-            <w:ins w:id="1037" w:author="Tiếp thu thẩm định lần 5, bản 1.3.13 (Claude)" w:date="2026-09-29T16:41:24Z">
+                <w:ins w:id="1044" w:author="Tiếp thu thẩm định lần 5, bản 1.3.13 (Claude)" w:date="2026-09-29T18:33:54Z"/>
+                <w:ins w:id="1035" w:author="Tiếp thu thẩm định lần 5, bản 1.3.13 (Claude)" w:date="2026-09-29T18:33:54Z"/>
+                <w:ins w:id="1026" w:author="Tiếp thu thẩm định lần 5, bản 1.3.13 (Claude)" w:date="2026-09-29T18:33:54Z"/>
+                <w:rFonts w:asciiTheme="majorHAnsi" w:hAnsiTheme="majorHAnsi" w:cstheme="majorHAnsi"/>
+                <w:sz w:val="28"/>
+                <w:szCs w:val="28"/>
+              </w:rPr>
+            </w:pPr>
+            <w:ins w:id="1043" w:author="Tiếp thu thẩm định lần 5, bản 1.3.13 (Claude)" w:date="2026-09-29T18:33:54Z">
               <w:r>
                 <w:rPr>
                   <w:rFonts w:asciiTheme="majorHAnsi" w:hAnsiTheme="majorHAnsi" w:cstheme="majorHAnsi"/>
@@ -5275,15 +5425,15 @@
               <w:widowControl w:val="0"/>
               <w:jc w:val="both"/>
               <w:rPr>
-                <w:ins w:id="1040" w:author="Tiếp thu thẩm định lần 5, bản 1.3.13 (Claude)" w:date="2026-09-29T16:41:24Z"/>
-                <w:ins w:id="1031" w:author="Tiếp thu thẩm định lần 5, bản 1.3.13 (Claude)" w:date="2026-09-29T16:41:24Z"/>
-                <w:ins w:id="1022" w:author="Tiếp thu thẩm định lần 5, bản 1.3.13 (Claude)" w:date="2026-09-29T16:41:24Z"/>
-                <w:rFonts w:asciiTheme="majorHAnsi" w:hAnsiTheme="majorHAnsi" w:cstheme="majorHAnsi"/>
-                <w:sz w:val="28"/>
-                <w:szCs w:val="28"/>
-              </w:rPr>
-            </w:pPr>
-            <w:ins w:id="1039" w:author="Tiếp thu thẩm định lần 5, bản 1.3.13 (Claude)" w:date="2026-09-29T16:41:24Z">
+                <w:ins w:id="1046" w:author="Tiếp thu thẩm định lần 5, bản 1.3.13 (Claude)" w:date="2026-09-29T18:33:54Z"/>
+                <w:ins w:id="1037" w:author="Tiếp thu thẩm định lần 5, bản 1.3.13 (Claude)" w:date="2026-09-29T18:33:54Z"/>
+                <w:ins w:id="1028" w:author="Tiếp thu thẩm định lần 5, bản 1.3.13 (Claude)" w:date="2026-09-29T18:33:54Z"/>
+                <w:rFonts w:asciiTheme="majorHAnsi" w:hAnsiTheme="majorHAnsi" w:cstheme="majorHAnsi"/>
+                <w:sz w:val="28"/>
+                <w:szCs w:val="28"/>
+              </w:rPr>
+            </w:pPr>
+            <w:ins w:id="1045" w:author="Tiếp thu thẩm định lần 5, bản 1.3.13 (Claude)" w:date="2026-09-29T18:33:54Z">
               <w:r>
                 <w:rPr>
                   <w:rFonts w:asciiTheme="majorHAnsi" w:hAnsiTheme="majorHAnsi" w:cstheme="majorHAnsi"/>
@@ -5305,15 +5455,15 @@
               <w:widowControl w:val="0"/>
               <w:jc w:val="center"/>
               <w:rPr>
-                <w:ins w:id="1042" w:author="Tiếp thu thẩm định lần 5, bản 1.3.13 (Claude)" w:date="2026-09-29T16:41:24Z"/>
-                <w:ins w:id="1033" w:author="Tiếp thu thẩm định lần 5, bản 1.3.13 (Claude)" w:date="2026-09-29T16:41:24Z"/>
-                <w:ins w:id="1024" w:author="Tiếp thu thẩm định lần 5, bản 1.3.13 (Claude)" w:date="2026-09-29T16:41:24Z"/>
-                <w:rFonts w:asciiTheme="majorHAnsi" w:hAnsiTheme="majorHAnsi" w:cstheme="majorHAnsi"/>
-                <w:sz w:val="28"/>
-                <w:szCs w:val="28"/>
-              </w:rPr>
-            </w:pPr>
-            <w:ins w:id="1041" w:author="Tiếp thu thẩm định lần 5, bản 1.3.13 (Claude)" w:date="2026-09-29T16:41:24Z">
+                <w:ins w:id="1048" w:author="Tiếp thu thẩm định lần 5, bản 1.3.13 (Claude)" w:date="2026-09-29T18:33:54Z"/>
+                <w:ins w:id="1039" w:author="Tiếp thu thẩm định lần 5, bản 1.3.13 (Claude)" w:date="2026-09-29T18:33:54Z"/>
+                <w:ins w:id="1030" w:author="Tiếp thu thẩm định lần 5, bản 1.3.13 (Claude)" w:date="2026-09-29T18:33:54Z"/>
+                <w:rFonts w:asciiTheme="majorHAnsi" w:hAnsiTheme="majorHAnsi" w:cstheme="majorHAnsi"/>
+                <w:sz w:val="28"/>
+                <w:szCs w:val="28"/>
+              </w:rPr>
+            </w:pPr>
+            <w:ins w:id="1047" w:author="Tiếp thu thẩm định lần 5, bản 1.3.13 (Claude)" w:date="2026-09-29T18:33:54Z">
               <w:r>
                 <w:rPr>
                   <w:rFonts w:asciiTheme="majorHAnsi" w:hAnsiTheme="majorHAnsi" w:cstheme="majorHAnsi"/>
@@ -5329,7 +5479,7 @@
       <w:tr>
         <w:trPr>
           <w:jc w:val="center"/>
-          <w:ins w:id="1043" w:author="Tiếp thu thẩm định lần 5, bản 1.3.13 (Claude)" w:date="2026-09-29T16:41:24Z"/>
+          <w:ins w:id="1049" w:author="Tiếp thu thẩm định lần 5, bản 1.3.13 (Claude)" w:date="2026-09-29T18:33:54Z"/>
         </w:trPr>
         <w:tc>
           <w:tcPr>
@@ -5341,16 +5491,16 @@
               <w:widowControl w:val="0"/>
               <w:jc w:val="center"/>
               <w:rPr>
-                <w:ins w:id="1045" w:author="Tiếp thu thẩm định lần 5, bản 1.3.13 (Claude)" w:date="2026-09-29T16:41:24Z"/>
-                <w:ins w:id="1036" w:author="Tiếp thu thẩm định lần 5, bản 1.3.13 (Claude)" w:date="2026-09-29T16:41:24Z"/>
-                <w:ins w:id="1027" w:author="Tiếp thu thẩm định lần 5, bản 1.3.13 (Claude)" w:date="2026-09-29T16:41:24Z"/>
-                <w:ins w:id="1018" w:author="Tiếp thu thẩm định lần 5, bản 1.3.13 (Claude)" w:date="2026-09-29T16:41:24Z"/>
-                <w:rFonts w:asciiTheme="majorHAnsi" w:hAnsiTheme="majorHAnsi" w:cstheme="majorHAnsi"/>
-                <w:sz w:val="28"/>
-                <w:szCs w:val="28"/>
-              </w:rPr>
-            </w:pPr>
-            <w:ins w:id="1044" w:author="Tiếp thu thẩm định lần 5, bản 1.3.13 (Claude)" w:date="2026-09-29T16:41:24Z">
+                <w:ins w:id="1051" w:author="Tiếp thu thẩm định lần 5, bản 1.3.13 (Claude)" w:date="2026-09-29T18:33:54Z"/>
+                <w:ins w:id="1042" w:author="Tiếp thu thẩm định lần 5, bản 1.3.13 (Claude)" w:date="2026-09-29T18:33:54Z"/>
+                <w:ins w:id="1033" w:author="Tiếp thu thẩm định lần 5, bản 1.3.13 (Claude)" w:date="2026-09-29T18:33:54Z"/>
+                <w:ins w:id="1024" w:author="Tiếp thu thẩm định lần 5, bản 1.3.13 (Claude)" w:date="2026-09-29T18:33:54Z"/>
+                <w:rFonts w:asciiTheme="majorHAnsi" w:hAnsiTheme="majorHAnsi" w:cstheme="majorHAnsi"/>
+                <w:sz w:val="28"/>
+                <w:szCs w:val="28"/>
+              </w:rPr>
+            </w:pPr>
+            <w:ins w:id="1050" w:author="Tiếp thu thẩm định lần 5, bản 1.3.13 (Claude)" w:date="2026-09-29T18:33:54Z">
               <w:r>
                 <w:rPr>
                   <w:rFonts w:asciiTheme="majorHAnsi" w:hAnsiTheme="majorHAnsi" w:cstheme="majorHAnsi"/>
@@ -5372,16 +5522,16 @@
               <w:widowControl w:val="0"/>
               <w:jc w:val="both"/>
               <w:rPr>
-                <w:ins w:id="1047" w:author="Tiếp thu thẩm định lần 5, bản 1.3.13 (Claude)" w:date="2026-09-29T16:41:24Z"/>
-                <w:ins w:id="1038" w:author="Tiếp thu thẩm định lần 5, bản 1.3.13 (Claude)" w:date="2026-09-29T16:41:24Z"/>
-                <w:ins w:id="1029" w:author="Tiếp thu thẩm định lần 5, bản 1.3.13 (Claude)" w:date="2026-09-29T16:41:24Z"/>
-                <w:ins w:id="1020" w:author="Tiếp thu thẩm định lần 5, bản 1.3.13 (Claude)" w:date="2026-09-29T16:41:24Z"/>
-                <w:rFonts w:asciiTheme="majorHAnsi" w:hAnsiTheme="majorHAnsi" w:cstheme="majorHAnsi"/>
-                <w:sz w:val="28"/>
-                <w:szCs w:val="28"/>
-              </w:rPr>
-            </w:pPr>
-            <w:ins w:id="1046" w:author="Tiếp thu thẩm định lần 5, bản 1.3.13 (Claude)" w:date="2026-09-29T16:41:24Z">
+                <w:ins w:id="1053" w:author="Tiếp thu thẩm định lần 5, bản 1.3.13 (Claude)" w:date="2026-09-29T18:33:54Z"/>
+                <w:ins w:id="1044" w:author="Tiếp thu thẩm định lần 5, bản 1.3.13 (Claude)" w:date="2026-09-29T18:33:54Z"/>
+                <w:ins w:id="1035" w:author="Tiếp thu thẩm định lần 5, bản 1.3.13 (Claude)" w:date="2026-09-29T18:33:54Z"/>
+                <w:ins w:id="1026" w:author="Tiếp thu thẩm định lần 5, bản 1.3.13 (Claude)" w:date="2026-09-29T18:33:54Z"/>
+                <w:rFonts w:asciiTheme="majorHAnsi" w:hAnsiTheme="majorHAnsi" w:cstheme="majorHAnsi"/>
+                <w:sz w:val="28"/>
+                <w:szCs w:val="28"/>
+              </w:rPr>
+            </w:pPr>
+            <w:ins w:id="1052" w:author="Tiếp thu thẩm định lần 5, bản 1.3.13 (Claude)" w:date="2026-09-29T18:33:54Z">
               <w:r>
                 <w:rPr>
                   <w:rFonts w:asciiTheme="majorHAnsi" w:hAnsiTheme="majorHAnsi" w:cstheme="majorHAnsi"/>
@@ -5403,16 +5553,16 @@
               <w:widowControl w:val="0"/>
               <w:jc w:val="both"/>
               <w:rPr>
-                <w:ins w:id="1049" w:author="Tiếp thu thẩm định lần 5, bản 1.3.13 (Claude)" w:date="2026-09-29T16:41:24Z"/>
-                <w:ins w:id="1040" w:author="Tiếp thu thẩm định lần 5, bản 1.3.13 (Claude)" w:date="2026-09-29T16:41:24Z"/>
-                <w:ins w:id="1031" w:author="Tiếp thu thẩm định lần 5, bản 1.3.13 (Claude)" w:date="2026-09-29T16:41:24Z"/>
-                <w:ins w:id="1022" w:author="Tiếp thu thẩm định lần 5, bản 1.3.13 (Claude)" w:date="2026-09-29T16:41:24Z"/>
-                <w:rFonts w:asciiTheme="majorHAnsi" w:hAnsiTheme="majorHAnsi" w:cstheme="majorHAnsi"/>
-                <w:sz w:val="28"/>
-                <w:szCs w:val="28"/>
-              </w:rPr>
-            </w:pPr>
-            <w:ins w:id="1048" w:author="Tiếp thu thẩm định lần 5, bản 1.3.13 (Claude)" w:date="2026-09-29T16:41:24Z">
+                <w:ins w:id="1055" w:author="Tiếp thu thẩm định lần 5, bản 1.3.13 (Claude)" w:date="2026-09-29T18:33:54Z"/>
+                <w:ins w:id="1046" w:author="Tiếp thu thẩm định lần 5, bản 1.3.13 (Claude)" w:date="2026-09-29T18:33:54Z"/>
+                <w:ins w:id="1037" w:author="Tiếp thu thẩm định lần 5, bản 1.3.13 (Claude)" w:date="2026-09-29T18:33:54Z"/>
+                <w:ins w:id="1028" w:author="Tiếp thu thẩm định lần 5, bản 1.3.13 (Claude)" w:date="2026-09-29T18:33:54Z"/>
+                <w:rFonts w:asciiTheme="majorHAnsi" w:hAnsiTheme="majorHAnsi" w:cstheme="majorHAnsi"/>
+                <w:sz w:val="28"/>
+                <w:szCs w:val="28"/>
+              </w:rPr>
+            </w:pPr>
+            <w:ins w:id="1054" w:author="Tiếp thu thẩm định lần 5, bản 1.3.13 (Claude)" w:date="2026-09-29T18:33:54Z">
               <w:r>
                 <w:rPr>
                   <w:rFonts w:asciiTheme="majorHAnsi" w:hAnsiTheme="majorHAnsi" w:cstheme="majorHAnsi"/>
@@ -5434,16 +5584,16 @@
               <w:widowControl w:val="0"/>
               <w:jc w:val="center"/>
               <w:rPr>
-                <w:ins w:id="1051" w:author="Tiếp thu thẩm định lần 5, bản 1.3.13 (Claude)" w:date="2026-09-29T16:41:24Z"/>
-                <w:ins w:id="1042" w:author="Tiếp thu thẩm định lần 5, bản 1.3.13 (Claude)" w:date="2026-09-29T16:41:24Z"/>
-                <w:ins w:id="1033" w:author="Tiếp thu thẩm định lần 5, bản 1.3.13 (Claude)" w:date="2026-09-29T16:41:24Z"/>
-                <w:ins w:id="1024" w:author="Tiếp thu thẩm định lần 5, bản 1.3.13 (Claude)" w:date="2026-09-29T16:41:24Z"/>
-                <w:rFonts w:asciiTheme="majorHAnsi" w:hAnsiTheme="majorHAnsi" w:cstheme="majorHAnsi"/>
-                <w:sz w:val="28"/>
-                <w:szCs w:val="28"/>
-              </w:rPr>
-            </w:pPr>
-            <w:ins w:id="1050" w:author="Tiếp thu thẩm định lần 5, bản 1.3.13 (Claude)" w:date="2026-09-29T16:41:24Z">
+                <w:ins w:id="1057" w:author="Tiếp thu thẩm định lần 5, bản 1.3.13 (Claude)" w:date="2026-09-29T18:33:54Z"/>
+                <w:ins w:id="1048" w:author="Tiếp thu thẩm định lần 5, bản 1.3.13 (Claude)" w:date="2026-09-29T18:33:54Z"/>
+                <w:ins w:id="1039" w:author="Tiếp thu thẩm định lần 5, bản 1.3.13 (Claude)" w:date="2026-09-29T18:33:54Z"/>
+                <w:ins w:id="1030" w:author="Tiếp thu thẩm định lần 5, bản 1.3.13 (Claude)" w:date="2026-09-29T18:33:54Z"/>
+                <w:rFonts w:asciiTheme="majorHAnsi" w:hAnsiTheme="majorHAnsi" w:cstheme="majorHAnsi"/>
+                <w:sz w:val="28"/>
+                <w:szCs w:val="28"/>
+              </w:rPr>
+            </w:pPr>
+            <w:ins w:id="1056" w:author="Tiếp thu thẩm định lần 5, bản 1.3.13 (Claude)" w:date="2026-09-29T18:33:54Z">
               <w:r>
                 <w:rPr>
                   <w:rFonts w:asciiTheme="majorHAnsi" w:hAnsiTheme="majorHAnsi" w:cstheme="majorHAnsi"/>
@@ -5459,7 +5609,7 @@
       <w:tr>
         <w:trPr>
           <w:jc w:val="center"/>
-          <w:ins w:id="1052" w:author="Tiếp thu thẩm định lần 5, bản 1.3.13 (Claude)" w:date="2026-09-29T16:41:24Z"/>
+          <w:ins w:id="1058" w:author="Tiếp thu thẩm định lần 5, bản 1.3.13 (Claude)" w:date="2026-09-29T18:33:54Z"/>
         </w:trPr>
         <w:tc>
           <w:tcPr>
@@ -5471,17 +5621,17 @@
               <w:widowControl w:val="0"/>
               <w:jc w:val="center"/>
               <w:rPr>
-                <w:ins w:id="1054" w:author="Tiếp thu thẩm định lần 5, bản 1.3.13 (Claude)" w:date="2026-09-29T16:41:24Z"/>
-                <w:ins w:id="1045" w:author="Tiếp thu thẩm định lần 5, bản 1.3.13 (Claude)" w:date="2026-09-29T16:41:24Z"/>
-                <w:ins w:id="1036" w:author="Tiếp thu thẩm định lần 5, bản 1.3.13 (Claude)" w:date="2026-09-29T16:41:24Z"/>
-                <w:ins w:id="1027" w:author="Tiếp thu thẩm định lần 5, bản 1.3.13 (Claude)" w:date="2026-09-29T16:41:24Z"/>
-                <w:ins w:id="1018" w:author="Tiếp thu thẩm định lần 5, bản 1.3.13 (Claude)" w:date="2026-09-29T16:41:24Z"/>
-                <w:rFonts w:asciiTheme="majorHAnsi" w:hAnsiTheme="majorHAnsi" w:cstheme="majorHAnsi"/>
-                <w:sz w:val="28"/>
-                <w:szCs w:val="28"/>
-              </w:rPr>
-            </w:pPr>
-            <w:ins w:id="1053" w:author="Tiếp thu thẩm định lần 5, bản 1.3.13 (Claude)" w:date="2026-09-29T16:41:24Z">
+                <w:ins w:id="1060" w:author="Tiếp thu thẩm định lần 5, bản 1.3.13 (Claude)" w:date="2026-09-29T18:33:54Z"/>
+                <w:ins w:id="1051" w:author="Tiếp thu thẩm định lần 5, bản 1.3.13 (Claude)" w:date="2026-09-29T18:33:54Z"/>
+                <w:ins w:id="1042" w:author="Tiếp thu thẩm định lần 5, bản 1.3.13 (Claude)" w:date="2026-09-29T18:33:54Z"/>
+                <w:ins w:id="1033" w:author="Tiếp thu thẩm định lần 5, bản 1.3.13 (Claude)" w:date="2026-09-29T18:33:54Z"/>
+                <w:ins w:id="1024" w:author="Tiếp thu thẩm định lần 5, bản 1.3.13 (Claude)" w:date="2026-09-29T18:33:54Z"/>
+                <w:rFonts w:asciiTheme="majorHAnsi" w:hAnsiTheme="majorHAnsi" w:cstheme="majorHAnsi"/>
+                <w:sz w:val="28"/>
+                <w:szCs w:val="28"/>
+              </w:rPr>
+            </w:pPr>
+            <w:ins w:id="1059" w:author="Tiếp thu thẩm định lần 5, bản 1.3.13 (Claude)" w:date="2026-09-29T18:33:54Z">
               <w:r>
                 <w:rPr>
                   <w:rFonts w:asciiTheme="majorHAnsi" w:hAnsiTheme="majorHAnsi" w:cstheme="majorHAnsi"/>
@@ -5503,17 +5653,17 @@
               <w:widowControl w:val="0"/>
               <w:jc w:val="both"/>
               <w:rPr>
-                <w:ins w:id="1056" w:author="Tiếp thu thẩm định lần 5, bản 1.3.13 (Claude)" w:date="2026-09-29T16:41:24Z"/>
-                <w:ins w:id="1047" w:author="Tiếp thu thẩm định lần 5, bản 1.3.13 (Claude)" w:date="2026-09-29T16:41:24Z"/>
-                <w:ins w:id="1038" w:author="Tiếp thu thẩm định lần 5, bản 1.3.13 (Claude)" w:date="2026-09-29T16:41:24Z"/>
-                <w:ins w:id="1029" w:author="Tiếp thu thẩm định lần 5, bản 1.3.13 (Claude)" w:date="2026-09-29T16:41:24Z"/>
-                <w:ins w:id="1020" w:author="Tiếp thu thẩm định lần 5, bản 1.3.13 (Claude)" w:date="2026-09-29T16:41:24Z"/>
-                <w:rFonts w:asciiTheme="majorHAnsi" w:hAnsiTheme="majorHAnsi" w:cstheme="majorHAnsi"/>
-                <w:sz w:val="28"/>
-                <w:szCs w:val="28"/>
-              </w:rPr>
-            </w:pPr>
-            <w:ins w:id="1055" w:author="Tiếp thu thẩm định lần 5, bản 1.3.13 (Claude)" w:date="2026-09-29T16:41:24Z">
+                <w:ins w:id="1062" w:author="Tiếp thu thẩm định lần 5, bản 1.3.13 (Claude)" w:date="2026-09-29T18:33:54Z"/>
+                <w:ins w:id="1053" w:author="Tiếp thu thẩm định lần 5, bản 1.3.13 (Claude)" w:date="2026-09-29T18:33:54Z"/>
+                <w:ins w:id="1044" w:author="Tiếp thu thẩm định lần 5, bản 1.3.13 (Claude)" w:date="2026-09-29T18:33:54Z"/>
+                <w:ins w:id="1035" w:author="Tiếp thu thẩm định lần 5, bản 1.3.13 (Claude)" w:date="2026-09-29T18:33:54Z"/>
+                <w:ins w:id="1026" w:author="Tiếp thu thẩm định lần 5, bản 1.3.13 (Claude)" w:date="2026-09-29T18:33:54Z"/>
+                <w:rFonts w:asciiTheme="majorHAnsi" w:hAnsiTheme="majorHAnsi" w:cstheme="majorHAnsi"/>
+                <w:sz w:val="28"/>
+                <w:szCs w:val="28"/>
+              </w:rPr>
+            </w:pPr>
+            <w:ins w:id="1061" w:author="Tiếp thu thẩm định lần 5, bản 1.3.13 (Claude)" w:date="2026-09-29T18:33:54Z">
               <w:r>
                 <w:rPr>
                   <w:rFonts w:asciiTheme="majorHAnsi" w:hAnsiTheme="majorHAnsi" w:cstheme="majorHAnsi"/>
@@ -5535,17 +5685,17 @@
               <w:widowControl w:val="0"/>
               <w:jc w:val="both"/>
               <w:rPr>
-                <w:ins w:id="1058" w:author="Tiếp thu thẩm định lần 5, bản 1.3.13 (Claude)" w:date="2026-09-29T16:41:24Z"/>
-                <w:ins w:id="1049" w:author="Tiếp thu thẩm định lần 5, bản 1.3.13 (Claude)" w:date="2026-09-29T16:41:24Z"/>
-                <w:ins w:id="1040" w:author="Tiếp thu thẩm định lần 5, bản 1.3.13 (Claude)" w:date="2026-09-29T16:41:24Z"/>
-                <w:ins w:id="1031" w:author="Tiếp thu thẩm định lần 5, bản 1.3.13 (Claude)" w:date="2026-09-29T16:41:24Z"/>
-                <w:ins w:id="1022" w:author="Tiếp thu thẩm định lần 5, bản 1.3.13 (Claude)" w:date="2026-09-29T16:41:24Z"/>
-                <w:rFonts w:asciiTheme="majorHAnsi" w:hAnsiTheme="majorHAnsi" w:cstheme="majorHAnsi"/>
-                <w:sz w:val="28"/>
-                <w:szCs w:val="28"/>
-              </w:rPr>
-            </w:pPr>
-            <w:ins w:id="1057" w:author="Tiếp thu thẩm định lần 5, bản 1.3.13 (Claude)" w:date="2026-09-29T16:41:24Z">
+                <w:ins w:id="1064" w:author="Tiếp thu thẩm định lần 5, bản 1.3.13 (Claude)" w:date="2026-09-29T18:33:54Z"/>
+                <w:ins w:id="1055" w:author="Tiếp thu thẩm định lần 5, bản 1.3.13 (Claude)" w:date="2026-09-29T18:33:54Z"/>
+                <w:ins w:id="1046" w:author="Tiếp thu thẩm định lần 5, bản 1.3.13 (Claude)" w:date="2026-09-29T18:33:54Z"/>
+                <w:ins w:id="1037" w:author="Tiếp thu thẩm định lần 5, bản 1.3.13 (Claude)" w:date="2026-09-29T18:33:54Z"/>
+                <w:ins w:id="1028" w:author="Tiếp thu thẩm định lần 5, bản 1.3.13 (Claude)" w:date="2026-09-29T18:33:54Z"/>
+                <w:rFonts w:asciiTheme="majorHAnsi" w:hAnsiTheme="majorHAnsi" w:cstheme="majorHAnsi"/>
+                <w:sz w:val="28"/>
+                <w:szCs w:val="28"/>
+              </w:rPr>
+            </w:pPr>
+            <w:ins w:id="1063" w:author="Tiếp thu thẩm định lần 5, bản 1.3.13 (Claude)" w:date="2026-09-29T18:33:54Z">
               <w:r>
                 <w:rPr>
                   <w:rFonts w:asciiTheme="majorHAnsi" w:hAnsiTheme="majorHAnsi" w:cstheme="majorHAnsi"/>
@@ -5567,17 +5717,17 @@
               <w:widowControl w:val="0"/>
               <w:jc w:val="center"/>
               <w:rPr>
-                <w:ins w:id="1060" w:author="Tiếp thu thẩm định lần 5, bản 1.3.13 (Claude)" w:date="2026-09-29T16:41:24Z"/>
-                <w:ins w:id="1051" w:author="Tiếp thu thẩm định lần 5, bản 1.3.13 (Claude)" w:date="2026-09-29T16:41:24Z"/>
-                <w:ins w:id="1042" w:author="Tiếp thu thẩm định lần 5, bản 1.3.13 (Claude)" w:date="2026-09-29T16:41:24Z"/>
-                <w:ins w:id="1033" w:author="Tiếp thu thẩm định lần 5, bản 1.3.13 (Claude)" w:date="2026-09-29T16:41:24Z"/>
-                <w:ins w:id="1024" w:author="Tiếp thu thẩm định lần 5, bản 1.3.13 (Claude)" w:date="2026-09-29T16:41:24Z"/>
-                <w:rFonts w:asciiTheme="majorHAnsi" w:hAnsiTheme="majorHAnsi" w:cstheme="majorHAnsi"/>
-                <w:sz w:val="28"/>
-                <w:szCs w:val="28"/>
-              </w:rPr>
-            </w:pPr>
-            <w:ins w:id="1059" w:author="Tiếp thu thẩm định lần 5, bản 1.3.13 (Claude)" w:date="2026-09-29T16:41:24Z">
+                <w:ins w:id="1066" w:author="Tiếp thu thẩm định lần 5, bản 1.3.13 (Claude)" w:date="2026-09-29T18:33:54Z"/>
+                <w:ins w:id="1057" w:author="Tiếp thu thẩm định lần 5, bản 1.3.13 (Claude)" w:date="2026-09-29T18:33:54Z"/>
+                <w:ins w:id="1048" w:author="Tiếp thu thẩm định lần 5, bản 1.3.13 (Claude)" w:date="2026-09-29T18:33:54Z"/>
+                <w:ins w:id="1039" w:author="Tiếp thu thẩm định lần 5, bản 1.3.13 (Claude)" w:date="2026-09-29T18:33:54Z"/>
+                <w:ins w:id="1030" w:author="Tiếp thu thẩm định lần 5, bản 1.3.13 (Claude)" w:date="2026-09-29T18:33:54Z"/>
+                <w:rFonts w:asciiTheme="majorHAnsi" w:hAnsiTheme="majorHAnsi" w:cstheme="majorHAnsi"/>
+                <w:sz w:val="28"/>
+                <w:szCs w:val="28"/>
+              </w:rPr>
+            </w:pPr>
+            <w:ins w:id="1065" w:author="Tiếp thu thẩm định lần 5, bản 1.3.13 (Claude)" w:date="2026-09-29T18:33:54Z">
               <w:r>
                 <w:rPr>
                   <w:rFonts w:asciiTheme="majorHAnsi" w:hAnsiTheme="majorHAnsi" w:cstheme="majorHAnsi"/>
@@ -5684,6 +5834,28 @@
           <w:shd w:val="clear" w:color="auto" w:fill="FFFFFF"/>
         </w:rPr>
       </w:pPr>
+      <w:del w:id="1007" w:author="Sửa theo rà soát 897 chính thức 29/9 (Claude)" w:date="2026-09-29T18:36:18Z">
+        <w:r>
+          <w:rPr>
+            <w:rFonts w:asciiTheme="majorHAnsi" w:hAnsiTheme="majorHAnsi" w:cstheme="majorHAnsi"/>
+            <w:sz w:val="28"/>
+            <w:szCs w:val="28"/>
+            <w:shd w:val="clear" w:color="auto" w:fill="FFFFFF"/>
+          </w:rPr>
+          <w:delText xml:space="preserve">- Nội dung hai thang điểm quy đổi đã có văn bản phân định (Quyết định số 2119/QĐ-CĐKT ngày 28/9/2026 ban hành</w:delText>
+        </w:r>
+      </w:del>
+      <w:ins w:id="1008" w:author="Sửa theo rà soát 897 chính thức 29/9 (Claude)" w:date="2026-09-29T18:36:18Z">
+        <w:r>
+          <w:rPr>
+            <w:rFonts w:asciiTheme="majorHAnsi" w:hAnsiTheme="majorHAnsi" w:cstheme="majorHAnsi"/>
+            <w:sz w:val="28"/>
+            <w:szCs w:val="28"/>
+            <w:shd w:val="clear" w:color="auto" w:fill="FFFFFF"/>
+          </w:rPr>
+          <w:t xml:space="preserve">- Nội dung hai thang điểm quy đổi đã có văn bản phân định (Quyết định số 2119/QĐ-CĐKT ban hành</w:t>
+        </w:r>
+      </w:ins>
       <w:r>
         <w:rPr>
           <w:rFonts w:asciiTheme="majorHAnsi" w:hAnsiTheme="majorHAnsi" w:cstheme="majorHAnsi"/>
@@ -5691,7 +5863,7 @@
           <w:szCs w:val="28"/>
           <w:shd w:val="clear" w:color="auto" w:fill="FFFFFF"/>
         </w:rPr>
-        <w:t xml:space="preserve">- Nội dung hai thang điểm quy đổi đã có văn bản phân định (Quyết định số 2119/QĐ-CĐKT ngày 28/9/2026 ban hành Danh mục sản phẩm, công việc); kết quả KPI đã chấm trước ngày 28/9/2026 Bộ công cụ không tự tính lại; một số nội dung đánh giá KPI (trong đó có quy ước nhân hệ số sản phẩm với hệ số mức độ) chờ ý kiến Phòng TCCB&amp;CTHSSV;</w:t>
+        <w:t xml:space="preserve"> Danh mục sản phẩm, công việc); kết quả KPI đã chấm trước ngày 28/9/2026 Bộ công cụ không tự tính lại; một số nội dung đánh giá KPI (trong đó có quy ước nhân hệ số sản phẩm với hệ số mức độ) chờ ý kiến Phòng TCCB&amp;CTHSSV;</w:t>
       </w:r>
       <w:r>
         <w:rPr>
@@ -5725,7 +5897,7 @@
         </w:rPr>
         <w:t xml:space="preserve">- Thao tác chặn ghi là biện pháp hỗ trợ, </w:t>
       </w:r>
-      <w:del w:id="1061" w:author="Tiếp thu thẩm định lần 5, bản 1.3.13 (Claude)" w:date="2026-09-29T16:41:24Z">
+      <w:del w:id="1067" w:author="Tiếp thu thẩm định lần 5, bản 1.3.13 (Claude)" w:date="2026-09-29T18:33:54Z">
         <w:r>
           <w:rPr>
             <w:rFonts w:asciiTheme="majorHAnsi" w:hAnsiTheme="majorHAnsi" w:cstheme="majorHAnsi"/>
@@ -5736,7 +5908,7 @@
           <w:delText xml:space="preserve">không kiểm được chương trình viết sẵn trong tệp;</w:delText>
         </w:r>
       </w:del>
-      <w:ins w:id="1062" w:author="Tiếp thu thẩm định lần 5, bản 1.3.13 (Claude)" w:date="2026-09-29T16:41:24Z">
+      <w:ins w:id="1068" w:author="Tiếp thu thẩm định lần 5, bản 1.3.13 (Claude)" w:date="2026-09-29T18:33:54Z">
         <w:r>
           <w:rPr>
             <w:rFonts w:asciiTheme="majorHAnsi" w:hAnsiTheme="majorHAnsi" w:cstheme="majorHAnsi"/>
@@ -5793,7 +5965,7 @@
           <w:shd w:val="clear" w:color="auto" w:fill="FFFFFF"/>
         </w:rPr>
       </w:pPr>
-      <w:del w:id="1063" w:author="Tiếp thu thẩm định lần 5, bản 1.3.13 (Claude)" w:date="2026-09-29T16:41:24Z">
+      <w:del w:id="1069" w:author="Tiếp thu thẩm định lần 5, bản 1.3.13 (Claude)" w:date="2026-09-29T18:33:54Z">
         <w:r>
           <w:rPr>
             <w:rFonts w:asciiTheme="majorHAnsi" w:hAnsiTheme="majorHAnsi" w:cstheme="majorHAnsi"/>
@@ -5806,7 +5978,7 @@
           <w:delText xml:space="preserve">6. Kết quả thẩm định độc lập lần 1, lần 2, lần 3, lần 4, tiếp thu, giải trình</w:delText>
         </w:r>
       </w:del>
-      <w:ins w:id="1064" w:author="Tiếp thu thẩm định lần 5, bản 1.3.13 (Claude)" w:date="2026-09-29T16:41:24Z">
+      <w:ins w:id="1070" w:author="Tiếp thu thẩm định lần 5, bản 1.3.13 (Claude)" w:date="2026-09-29T18:33:54Z">
         <w:r>
           <w:rPr>
             <w:rFonts w:asciiTheme="majorHAnsi" w:hAnsiTheme="majorHAnsi" w:cstheme="majorHAnsi"/>
@@ -6844,7 +7016,7 @@
                 <w:szCs w:val="28"/>
               </w:rPr>
             </w:pPr>
-            <w:del w:id="1067" w:author="Tiếp thu thẩm định lần 5, bản 1.3.13 (Claude)" w:date="2026-09-29T16:41:24Z">
+            <w:del w:id="1073" w:author="Tiếp thu thẩm định lần 5, bản 1.3.13 (Claude)" w:date="2026-09-29T18:33:54Z">
               <w:r>
                 <w:rPr>
                   <w:rFonts w:asciiTheme="majorHAnsi" w:hAnsiTheme="majorHAnsi" w:cstheme="majorHAnsi"/>
@@ -6854,7 +7026,7 @@
                 <w:delText>Phiếu nghiệm thu bản 1.3.1: 15 ca, thêm 2 ca chỉ chạy trên Cowork (trước 05/10/2026)</w:delText>
               </w:r>
             </w:del>
-            <w:ins w:id="1068" w:author="Tiếp thu thẩm định lần 5, bản 1.3.13 (Claude)" w:date="2026-09-29T16:41:24Z">
+            <w:ins w:id="1074" w:author="Tiếp thu thẩm định lần 5, bản 1.3.13 (Claude)" w:date="2026-09-29T18:33:54Z">
               <w:r>
                 <w:rPr>
                   <w:rFonts w:asciiTheme="majorHAnsi" w:hAnsiTheme="majorHAnsi" w:cstheme="majorHAnsi"/>
@@ -7065,7 +7237,7 @@
               </w:rPr>
               <w:t xml:space="preserve">ngày 27/9/2026 lên 1.3.1, 1.3.2, </w:t>
             </w:r>
-            <w:del w:id="1065" w:author="Tiếp thu thẩm định lần 5, bản 1.3.13 (Claude)" w:date="2026-09-29T16:41:24Z">
+            <w:del w:id="1071" w:author="Tiếp thu thẩm định lần 5, bản 1.3.13 (Claude)" w:date="2026-09-29T18:33:54Z">
               <w:r>
                 <w:rPr>
                   <w:rFonts w:asciiTheme="majorHAnsi" w:hAnsiTheme="majorHAnsi" w:cstheme="majorHAnsi"/>
@@ -7075,7 +7247,7 @@
                 <w:delText xml:space="preserve">ngày 28 - 29/9/2026 lên 1.3.3 - 1.3.12,</w:delText>
               </w:r>
             </w:del>
-            <w:ins w:id="1066" w:author="Tiếp thu thẩm định lần 5, bản 1.3.13 (Claude)" w:date="2026-09-29T16:41:24Z">
+            <w:ins w:id="1072" w:author="Tiếp thu thẩm định lần 5, bản 1.3.13 (Claude)" w:date="2026-09-29T18:33:54Z">
               <w:r>
                 <w:rPr>
                   <w:rFonts w:asciiTheme="majorHAnsi" w:hAnsiTheme="majorHAnsi" w:cstheme="majorHAnsi"/>
@@ -7530,7 +7702,7 @@
                 <w:szCs w:val="28"/>
               </w:rPr>
             </w:pPr>
-            <w:del w:id="1069" w:author="Tiếp thu thẩm định lần 5, bản 1.3.13 (Claude)" w:date="2026-09-29T16:41:24Z">
+            <w:del w:id="1075" w:author="Tiếp thu thẩm định lần 5, bản 1.3.13 (Claude)" w:date="2026-09-29T18:33:54Z">
               <w:r>
                 <w:rPr>
                   <w:rFonts w:asciiTheme="majorHAnsi" w:hAnsiTheme="majorHAnsi" w:cstheme="majorHAnsi"/>
@@ -7540,7 +7712,7 @@
                 <w:delText>Biên bản kiểm tra bằng tài khoản thử (trước 30/9/2026)</w:delText>
               </w:r>
             </w:del>
-            <w:ins w:id="1070" w:author="Tiếp thu thẩm định lần 5, bản 1.3.13 (Claude)" w:date="2026-09-29T16:41:24Z">
+            <w:ins w:id="1076" w:author="Tiếp thu thẩm định lần 5, bản 1.3.13 (Claude)" w:date="2026-09-29T18:33:54Z">
               <w:r>
                 <w:rPr>
                   <w:rFonts w:asciiTheme="majorHAnsi" w:hAnsiTheme="majorHAnsi" w:cstheme="majorHAnsi"/>
@@ -8509,7 +8681,7 @@
       <w:tr>
         <w:trPr>
           <w:jc w:val="center"/>
-          <w:ins w:id="1071" w:author="Tiếp thu thẩm định lần 5, bản 1.3.13 (Claude)" w:date="2026-09-29T16:41:24Z"/>
+          <w:ins w:id="1077" w:author="Tiếp thu thẩm định lần 5, bản 1.3.13 (Claude)" w:date="2026-09-29T18:33:54Z"/>
         </w:trPr>
         <w:tc>
           <w:tcPr>
@@ -8521,13 +8693,13 @@
               <w:widowControl w:val="0"/>
               <w:jc w:val="center"/>
               <w:rPr>
-                <w:ins w:id="1073" w:author="Tiếp thu thẩm định lần 5, bản 1.3.13 (Claude)" w:date="2026-09-29T16:41:24Z"/>
-                <w:rFonts w:asciiTheme="majorHAnsi" w:hAnsiTheme="majorHAnsi" w:cstheme="majorHAnsi"/>
-                <w:sz w:val="28"/>
-                <w:szCs w:val="28"/>
-              </w:rPr>
-            </w:pPr>
-            <w:ins w:id="1072" w:author="Tiếp thu thẩm định lần 5, bản 1.3.13 (Claude)" w:date="2026-09-29T16:41:24Z">
+                <w:ins w:id="1079" w:author="Tiếp thu thẩm định lần 5, bản 1.3.13 (Claude)" w:date="2026-09-29T18:33:54Z"/>
+                <w:rFonts w:asciiTheme="majorHAnsi" w:hAnsiTheme="majorHAnsi" w:cstheme="majorHAnsi"/>
+                <w:sz w:val="28"/>
+                <w:szCs w:val="28"/>
+              </w:rPr>
+            </w:pPr>
+            <w:ins w:id="1078" w:author="Tiếp thu thẩm định lần 5, bản 1.3.13 (Claude)" w:date="2026-09-29T18:33:54Z">
               <w:r>
                 <w:rPr>
                   <w:rFonts w:asciiTheme="majorHAnsi" w:hAnsiTheme="majorHAnsi" w:cstheme="majorHAnsi"/>
@@ -8549,13 +8721,13 @@
               <w:widowControl w:val="0"/>
               <w:jc w:val="both"/>
               <w:rPr>
-                <w:ins w:id="1075" w:author="Tiếp thu thẩm định lần 5, bản 1.3.13 (Claude)" w:date="2026-09-29T16:41:24Z"/>
-                <w:rFonts w:asciiTheme="majorHAnsi" w:hAnsiTheme="majorHAnsi" w:cstheme="majorHAnsi"/>
-                <w:sz w:val="28"/>
-                <w:szCs w:val="28"/>
-              </w:rPr>
-            </w:pPr>
-            <w:ins w:id="1074" w:author="Tiếp thu thẩm định lần 5, bản 1.3.13 (Claude)" w:date="2026-09-29T16:41:24Z">
+                <w:ins w:id="1081" w:author="Tiếp thu thẩm định lần 5, bản 1.3.13 (Claude)" w:date="2026-09-29T18:33:54Z"/>
+                <w:rFonts w:asciiTheme="majorHAnsi" w:hAnsiTheme="majorHAnsi" w:cstheme="majorHAnsi"/>
+                <w:sz w:val="28"/>
+                <w:szCs w:val="28"/>
+              </w:rPr>
+            </w:pPr>
+            <w:ins w:id="1080" w:author="Tiếp thu thẩm định lần 5, bản 1.3.13 (Claude)" w:date="2026-09-29T18:33:54Z">
               <w:r>
                 <w:rPr>
                   <w:rFonts w:asciiTheme="majorHAnsi" w:hAnsiTheme="majorHAnsi" w:cstheme="majorHAnsi"/>
@@ -8577,13 +8749,13 @@
               <w:widowControl w:val="0"/>
               <w:jc w:val="both"/>
               <w:rPr>
-                <w:ins w:id="1077" w:author="Tiếp thu thẩm định lần 5, bản 1.3.13 (Claude)" w:date="2026-09-29T16:41:24Z"/>
-                <w:rFonts w:asciiTheme="majorHAnsi" w:hAnsiTheme="majorHAnsi" w:cstheme="majorHAnsi"/>
-                <w:sz w:val="28"/>
-                <w:szCs w:val="28"/>
-              </w:rPr>
-            </w:pPr>
-            <w:ins w:id="1076" w:author="Tiếp thu thẩm định lần 5, bản 1.3.13 (Claude)" w:date="2026-09-29T16:41:24Z">
+                <w:ins w:id="1083" w:author="Tiếp thu thẩm định lần 5, bản 1.3.13 (Claude)" w:date="2026-09-29T18:33:54Z"/>
+                <w:rFonts w:asciiTheme="majorHAnsi" w:hAnsiTheme="majorHAnsi" w:cstheme="majorHAnsi"/>
+                <w:sz w:val="28"/>
+                <w:szCs w:val="28"/>
+              </w:rPr>
+            </w:pPr>
+            <w:ins w:id="1082" w:author="Tiếp thu thẩm định lần 5, bản 1.3.13 (Claude)" w:date="2026-09-29T18:33:54Z">
               <w:r>
                 <w:rPr>
                   <w:rFonts w:asciiTheme="majorHAnsi" w:hAnsiTheme="majorHAnsi" w:cstheme="majorHAnsi"/>
@@ -8605,13 +8777,13 @@
               <w:widowControl w:val="0"/>
               <w:jc w:val="both"/>
               <w:rPr>
-                <w:ins w:id="1079" w:author="Tiếp thu thẩm định lần 5, bản 1.3.13 (Claude)" w:date="2026-09-29T16:41:24Z"/>
-                <w:rFonts w:asciiTheme="majorHAnsi" w:hAnsiTheme="majorHAnsi" w:cstheme="majorHAnsi"/>
-                <w:sz w:val="28"/>
-                <w:szCs w:val="28"/>
-              </w:rPr>
-            </w:pPr>
-            <w:ins w:id="1078" w:author="Tiếp thu thẩm định lần 5, bản 1.3.13 (Claude)" w:date="2026-09-29T16:41:24Z">
+                <w:ins w:id="1085" w:author="Tiếp thu thẩm định lần 5, bản 1.3.13 (Claude)" w:date="2026-09-29T18:33:54Z"/>
+                <w:rFonts w:asciiTheme="majorHAnsi" w:hAnsiTheme="majorHAnsi" w:cstheme="majorHAnsi"/>
+                <w:sz w:val="28"/>
+                <w:szCs w:val="28"/>
+              </w:rPr>
+            </w:pPr>
+            <w:ins w:id="1084" w:author="Tiếp thu thẩm định lần 5, bản 1.3.13 (Claude)" w:date="2026-09-29T18:33:54Z">
               <w:r>
                 <w:rPr>
                   <w:rFonts w:asciiTheme="majorHAnsi" w:hAnsiTheme="majorHAnsi" w:cstheme="majorHAnsi"/>
@@ -8627,7 +8799,7 @@
       <w:tr>
         <w:trPr>
           <w:jc w:val="center"/>
-          <w:ins w:id="1080" w:author="Tiếp thu thẩm định lần 5, bản 1.3.13 (Claude)" w:date="2026-09-29T16:41:24Z"/>
+          <w:ins w:id="1086" w:author="Tiếp thu thẩm định lần 5, bản 1.3.13 (Claude)" w:date="2026-09-29T18:33:54Z"/>
         </w:trPr>
         <w:tc>
           <w:tcPr>
@@ -8639,14 +8811,14 @@
               <w:widowControl w:val="0"/>
               <w:jc w:val="center"/>
               <w:rPr>
-                <w:ins w:id="1082" w:author="Tiếp thu thẩm định lần 5, bản 1.3.13 (Claude)" w:date="2026-09-29T16:41:24Z"/>
-                <w:ins w:id="1073" w:author="Tiếp thu thẩm định lần 5, bản 1.3.13 (Claude)" w:date="2026-09-29T16:41:24Z"/>
-                <w:rFonts w:asciiTheme="majorHAnsi" w:hAnsiTheme="majorHAnsi" w:cstheme="majorHAnsi"/>
-                <w:sz w:val="28"/>
-                <w:szCs w:val="28"/>
-              </w:rPr>
-            </w:pPr>
-            <w:ins w:id="1081" w:author="Tiếp thu thẩm định lần 5, bản 1.3.13 (Claude)" w:date="2026-09-29T16:41:24Z">
+                <w:ins w:id="1088" w:author="Tiếp thu thẩm định lần 5, bản 1.3.13 (Claude)" w:date="2026-09-29T18:33:54Z"/>
+                <w:ins w:id="1079" w:author="Tiếp thu thẩm định lần 5, bản 1.3.13 (Claude)" w:date="2026-09-29T18:33:54Z"/>
+                <w:rFonts w:asciiTheme="majorHAnsi" w:hAnsiTheme="majorHAnsi" w:cstheme="majorHAnsi"/>
+                <w:sz w:val="28"/>
+                <w:szCs w:val="28"/>
+              </w:rPr>
+            </w:pPr>
+            <w:ins w:id="1087" w:author="Tiếp thu thẩm định lần 5, bản 1.3.13 (Claude)" w:date="2026-09-29T18:33:54Z">
               <w:r>
                 <w:rPr>
                   <w:rFonts w:asciiTheme="majorHAnsi" w:hAnsiTheme="majorHAnsi" w:cstheme="majorHAnsi"/>
@@ -8668,14 +8840,14 @@
               <w:widowControl w:val="0"/>
               <w:jc w:val="both"/>
               <w:rPr>
-                <w:ins w:id="1084" w:author="Tiếp thu thẩm định lần 5, bản 1.3.13 (Claude)" w:date="2026-09-29T16:41:24Z"/>
-                <w:ins w:id="1075" w:author="Tiếp thu thẩm định lần 5, bản 1.3.13 (Claude)" w:date="2026-09-29T16:41:24Z"/>
-                <w:rFonts w:asciiTheme="majorHAnsi" w:hAnsiTheme="majorHAnsi" w:cstheme="majorHAnsi"/>
-                <w:sz w:val="28"/>
-                <w:szCs w:val="28"/>
-              </w:rPr>
-            </w:pPr>
-            <w:ins w:id="1083" w:author="Tiếp thu thẩm định lần 5, bản 1.3.13 (Claude)" w:date="2026-09-29T16:41:24Z">
+                <w:ins w:id="1090" w:author="Tiếp thu thẩm định lần 5, bản 1.3.13 (Claude)" w:date="2026-09-29T18:33:54Z"/>
+                <w:ins w:id="1081" w:author="Tiếp thu thẩm định lần 5, bản 1.3.13 (Claude)" w:date="2026-09-29T18:33:54Z"/>
+                <w:rFonts w:asciiTheme="majorHAnsi" w:hAnsiTheme="majorHAnsi" w:cstheme="majorHAnsi"/>
+                <w:sz w:val="28"/>
+                <w:szCs w:val="28"/>
+              </w:rPr>
+            </w:pPr>
+            <w:ins w:id="1089" w:author="Tiếp thu thẩm định lần 5, bản 1.3.13 (Claude)" w:date="2026-09-29T18:33:54Z">
               <w:r>
                 <w:rPr>
                   <w:rFonts w:asciiTheme="majorHAnsi" w:hAnsiTheme="majorHAnsi" w:cstheme="majorHAnsi"/>
@@ -8697,14 +8869,14 @@
               <w:widowControl w:val="0"/>
               <w:jc w:val="both"/>
               <w:rPr>
-                <w:ins w:id="1086" w:author="Tiếp thu thẩm định lần 5, bản 1.3.13 (Claude)" w:date="2026-09-29T16:41:24Z"/>
-                <w:ins w:id="1077" w:author="Tiếp thu thẩm định lần 5, bản 1.3.13 (Claude)" w:date="2026-09-29T16:41:24Z"/>
-                <w:rFonts w:asciiTheme="majorHAnsi" w:hAnsiTheme="majorHAnsi" w:cstheme="majorHAnsi"/>
-                <w:sz w:val="28"/>
-                <w:szCs w:val="28"/>
-              </w:rPr>
-            </w:pPr>
-            <w:ins w:id="1085" w:author="Tiếp thu thẩm định lần 5, bản 1.3.13 (Claude)" w:date="2026-09-29T16:41:24Z">
+                <w:ins w:id="1092" w:author="Tiếp thu thẩm định lần 5, bản 1.3.13 (Claude)" w:date="2026-09-29T18:33:54Z"/>
+                <w:ins w:id="1083" w:author="Tiếp thu thẩm định lần 5, bản 1.3.13 (Claude)" w:date="2026-09-29T18:33:54Z"/>
+                <w:rFonts w:asciiTheme="majorHAnsi" w:hAnsiTheme="majorHAnsi" w:cstheme="majorHAnsi"/>
+                <w:sz w:val="28"/>
+                <w:szCs w:val="28"/>
+              </w:rPr>
+            </w:pPr>
+            <w:ins w:id="1091" w:author="Tiếp thu thẩm định lần 5, bản 1.3.13 (Claude)" w:date="2026-09-29T18:33:54Z">
               <w:r>
                 <w:rPr>
                   <w:rFonts w:asciiTheme="majorHAnsi" w:hAnsiTheme="majorHAnsi" w:cstheme="majorHAnsi"/>
@@ -8726,14 +8898,14 @@
               <w:widowControl w:val="0"/>
               <w:jc w:val="both"/>
               <w:rPr>
-                <w:ins w:id="1088" w:author="Tiếp thu thẩm định lần 5, bản 1.3.13 (Claude)" w:date="2026-09-29T16:41:24Z"/>
-                <w:ins w:id="1079" w:author="Tiếp thu thẩm định lần 5, bản 1.3.13 (Claude)" w:date="2026-09-29T16:41:24Z"/>
-                <w:rFonts w:asciiTheme="majorHAnsi" w:hAnsiTheme="majorHAnsi" w:cstheme="majorHAnsi"/>
-                <w:sz w:val="28"/>
-                <w:szCs w:val="28"/>
-              </w:rPr>
-            </w:pPr>
-            <w:ins w:id="1087" w:author="Tiếp thu thẩm định lần 5, bản 1.3.13 (Claude)" w:date="2026-09-29T16:41:24Z">
+                <w:ins w:id="1094" w:author="Tiếp thu thẩm định lần 5, bản 1.3.13 (Claude)" w:date="2026-09-29T18:33:54Z"/>
+                <w:ins w:id="1085" w:author="Tiếp thu thẩm định lần 5, bản 1.3.13 (Claude)" w:date="2026-09-29T18:33:54Z"/>
+                <w:rFonts w:asciiTheme="majorHAnsi" w:hAnsiTheme="majorHAnsi" w:cstheme="majorHAnsi"/>
+                <w:sz w:val="28"/>
+                <w:szCs w:val="28"/>
+              </w:rPr>
+            </w:pPr>
+            <w:ins w:id="1093" w:author="Tiếp thu thẩm định lần 5, bản 1.3.13 (Claude)" w:date="2026-09-29T18:33:54Z">
               <w:r>
                 <w:rPr>
                   <w:rFonts w:asciiTheme="majorHAnsi" w:hAnsiTheme="majorHAnsi" w:cstheme="majorHAnsi"/>
@@ -8754,14 +8926,14 @@
         <w:ind w:firstLine="720"/>
         <w:jc w:val="both"/>
         <w:rPr>
-          <w:ins w:id="1090" w:author="Tiếp thu thẩm định lần 5, bản 1.3.13 (Claude)" w:date="2026-09-29T16:41:24Z"/>
+          <w:ins w:id="1096" w:author="Tiếp thu thẩm định lần 5, bản 1.3.13 (Claude)" w:date="2026-09-29T18:33:54Z"/>
           <w:rFonts w:asciiTheme="majorHAnsi" w:hAnsiTheme="majorHAnsi" w:cstheme="majorHAnsi"/>
           <w:sz w:val="28"/>
           <w:szCs w:val="28"/>
           <w:shd w:val="clear" w:color="auto" w:fill="FFFFFF"/>
         </w:rPr>
       </w:pPr>
-      <w:ins w:id="1089" w:author="Tiếp thu thẩm định lần 5, bản 1.3.13 (Claude)" w:date="2026-09-29T16:41:24Z">
+      <w:ins w:id="1095" w:author="Tiếp thu thẩm định lần 5, bản 1.3.13 (Claude)" w:date="2026-09-29T18:33:54Z">
         <w:r>
           <w:rPr>
             <w:rFonts w:asciiTheme="majorHAnsi" w:hAnsiTheme="majorHAnsi" w:cstheme="majorHAnsi"/>
@@ -8793,8 +8965,30 @@
           <w:szCs w:val="28"/>
           <w:shd w:val="clear" w:color="auto" w:fill="FFFFFF"/>
         </w:rPr>
-        <w:t xml:space="preserve">- Kết quả thẩm định độc lập lần 4 (27/9/2026): 04 báo cáo trên tệp plugin bản 1.3.1 (ChatGPT 72/100; Grok 79 - 85/100; Copilot 92/100; Gemini không chấm điểm) cùng xác nhận 02 lỗi phát hiện ở lần 3 đã được khắc phục, đồng ý kiểm thử có kiểm soát, chưa đồng ý triển khai diện rộng. ChatGPT chạy thử, nêu: thao tác chặn ghi còn hỏi xác nhận (thay vì chặn) khi không xác định được nơi ghi; ba văn bản mang tên Track Changes trong hồ sơ không còn đánh dấu (do người phụ trách chấp nhận thay đổi trên bản sao trong hồ sơ); metadata nghiệm thu ghi 3 lượt/ca trong khi chạy 2 lượt. Đã khắc phục trong bản 1.3.2 (mã SHA-256 83cd2815113ce30de0a7af64c6f1eee99c83907fca18a180312516848ffa7959); nghiệm thu lại 15 ca: 11/15 ca đạt cả 2 lượt, 26/30 lượt (1 lượt quá thời gian chờ) đạt. Bổ sung trạng thái:</w:t>
+        <w:t xml:space="preserve">- Kết quả thẩm định độc lập lần 4 (27/9/2026): 04 báo cáo trên tệp plugin bản 1.3.1 (ChatGPT 72/100; Grok 79 - 85/100; Copilot 92/100; Gemini không chấm điểm) cùng xác nhận 02 lỗi phát hiện ở lần 3 đã được khắc phục, đồng ý kiểm thử có kiểm soát, chưa đồng ý triển khai diện rộng. ChatGPT chạy thử, nêu: thao tác chặn ghi còn hỏi xác nhận (thay vì chặn) khi không xác định được nơi ghi; ba văn bản mang tên Track Changes trong hồ sơ không còn đánh dấu (do người phụ trách chấp nhận thay đổi trên bản sao trong hồ sơ); metadata nghiệm thu ghi 3 lượt/ca trong khi chạy 2 lượt. Đã khắc phục trong bản 1.3.2 (mã SHA-256 83cd2815113ce30de0a7af64c6f1eee99c83907fca18a180312516848ffa7959); nghiệm thu lại 15 ca: 11/15 ca đạt cả 2 lượt, 26/30 lượt (1 lượt quá thời gian chờ) </w:t>
       </w:r>
+      <w:del w:id="1009" w:author="Sửa theo rà soát 897 chính thức 29/9 (Claude)" w:date="2026-09-29T18:36:18Z">
+        <w:r>
+          <w:rPr>
+            <w:rFonts w:asciiTheme="majorHAnsi" w:hAnsiTheme="majorHAnsi" w:cstheme="majorHAnsi"/>
+            <w:sz w:val="28"/>
+            <w:szCs w:val="28"/>
+            <w:shd w:val="clear" w:color="auto" w:fill="FFFFFF"/>
+          </w:rPr>
+          <w:delText xml:space="preserve">đạt. Bổ sung trạng thái:</w:delText>
+        </w:r>
+      </w:del>
+      <w:ins w:id="1010" w:author="Sửa theo rà soát 897 chính thức 29/9 (Claude)" w:date="2026-09-29T18:36:18Z">
+        <w:r>
+          <w:rPr>
+            <w:rFonts w:asciiTheme="majorHAnsi" w:hAnsiTheme="majorHAnsi" w:cstheme="majorHAnsi"/>
+            <w:sz w:val="28"/>
+            <w:szCs w:val="28"/>
+            <w:shd w:val="clear" w:color="auto" w:fill="FFFFFF"/>
+          </w:rPr>
+          <w:t xml:space="preserve">đạt. Trạng thái xử lý tại bảng trên.</w:t>
+        </w:r>
+      </w:ins>
     </w:p>
     <w:p>
       <w:pPr>
@@ -8816,8 +9010,30 @@
           <w:szCs w:val="28"/>
           <w:shd w:val="clear" w:color="auto" w:fill="FFFFFF"/>
         </w:rPr>
-        <w:t>- Kết quả thẩm định độc lập lần 3 (27/9/2026): 04 báo cáo trên tệp plugin bản 1.3.0 (ChatGPT 70/100; Grok 78 - 83/100; Gemini 85/100; Copilot 92/100) cùng công nhận các lỗi Mức 1 của bản 1.2.1 đã được khắc phục và chưa đồng ý triển khai diện rộng. ChatGPT chạy thử mã, phát hiện 02 lỗi mới: nhật ký vẫn lưu nguyên câu lệnh; thao tác chặn ghi bị vượt qua bằng mã nhúng, lệnh lồng. Phòng TH-HC&amp;QT đã tái hiện, khắc phục trong bản 1.3.1 (tệp ktc-quan-tri-1.3.1.zip, mã SHA-256 e7af7718bbbf1a9181668ad346f4eefc1359ef48b1227172b2972618b7dc4821); xử lý 19 ý kiến: tiếp thu 13, tiếp thu một phần 05, không tiếp thu 01 có giải trình (Báo cáo tiếp thu, giải trình lần 3). Bổ sung trạng thái:</w:t>
+        <w:t xml:space="preserve">- Kết quả thẩm định độc lập lần 3 (27/9/2026): 04 báo cáo trên tệp plugin bản 1.3.0 (ChatGPT 70/100; Grok 78 - 83/100; Gemini 85/100; Copilot 92/100) cùng công nhận các lỗi Mức 1 của bản 1.2.1 đã được khắc phục và chưa đồng ý triển khai diện rộng. ChatGPT chạy thử mã, phát hiện 02 lỗi mới: nhật ký vẫn lưu nguyên câu lệnh; thao tác chặn ghi bị vượt qua bằng mã nhúng, lệnh lồng. Phòng TH-HC&amp;QT đã tái hiện, khắc phục trong bản 1.3.1 (tệp ktc-quan-tri-1.3.1.zip, mã SHA-256 e7af7718bbbf1a9181668ad346f4eefc1359ef48b1227172b2972618b7dc4821); xử lý 19 ý kiến: tiếp thu 13, tiếp thu một phần 05, không tiếp thu 01 có giải trình </w:t>
       </w:r>
+      <w:del w:id="1011" w:author="Sửa theo rà soát 897 chính thức 29/9 (Claude)" w:date="2026-09-29T18:36:18Z">
+        <w:r>
+          <w:rPr>
+            <w:rFonts w:asciiTheme="majorHAnsi" w:hAnsiTheme="majorHAnsi" w:cstheme="majorHAnsi"/>
+            <w:sz w:val="28"/>
+            <w:szCs w:val="28"/>
+            <w:shd w:val="clear" w:color="auto" w:fill="FFFFFF"/>
+          </w:rPr>
+          <w:delText xml:space="preserve">(Báo cáo tiếp thu, giải trình lần 3). Bổ sung trạng thái:</w:delText>
+        </w:r>
+      </w:del>
+      <w:ins w:id="1012" w:author="Sửa theo rà soát 897 chính thức 29/9 (Claude)" w:date="2026-09-29T18:36:18Z">
+        <w:r>
+          <w:rPr>
+            <w:rFonts w:asciiTheme="majorHAnsi" w:hAnsiTheme="majorHAnsi" w:cstheme="majorHAnsi"/>
+            <w:sz w:val="28"/>
+            <w:szCs w:val="28"/>
+            <w:shd w:val="clear" w:color="auto" w:fill="FFFFFF"/>
+          </w:rPr>
+          <w:t xml:space="preserve">(Báo cáo tiếp thu, giải trình lần 3). Trạng thái xử lý tại bảng trên.</w:t>
+        </w:r>
+      </w:ins>
     </w:p>
     <w:p>
       <w:pPr>
@@ -9053,14 +9269,14 @@
         <w:ind w:firstLine="720"/>
         <w:jc w:val="both"/>
         <w:rPr>
-          <w:ins w:id="1092" w:author="Tiếp thu thẩm định lần 5, bản 1.3.13 (Claude)" w:date="2026-09-29T16:41:24Z"/>
+          <w:ins w:id="1098" w:author="Tiếp thu thẩm định lần 5, bản 1.3.13 (Claude)" w:date="2026-09-29T18:33:54Z"/>
           <w:rFonts w:asciiTheme="majorHAnsi" w:hAnsiTheme="majorHAnsi" w:cstheme="majorHAnsi"/>
           <w:sz w:val="28"/>
           <w:szCs w:val="28"/>
           <w:shd w:val="clear" w:color="auto" w:fill="FFFFFF"/>
         </w:rPr>
       </w:pPr>
-      <w:ins w:id="1091" w:author="Tiếp thu thẩm định lần 5, bản 1.3.13 (Claude)" w:date="2026-09-29T16:41:24Z">
+      <w:ins w:id="1097" w:author="Tiếp thu thẩm định lần 5, bản 1.3.13 (Claude)" w:date="2026-09-29T18:33:54Z">
         <w:r>
           <w:rPr>
             <w:rFonts w:asciiTheme="majorHAnsi" w:hAnsiTheme="majorHAnsi" w:cstheme="majorHAnsi"/>
@@ -9097,7 +9313,7 @@
         </w:rPr>
         <w:t xml:space="preserve">Các nội dung chưa thực hiện: </w:t>
       </w:r>
-      <w:del w:id="1093" w:author="Tiếp thu thẩm định lần 5, bản 1.3.13 (Claude)" w:date="2026-09-29T16:41:24Z">
+      <w:del w:id="1099" w:author="Tiếp thu thẩm định lần 5, bản 1.3.13 (Claude)" w:date="2026-09-29T18:33:54Z">
         <w:r>
           <w:rPr>
             <w:rFonts w:asciiTheme="majorHAnsi" w:hAnsiTheme="majorHAnsi" w:cstheme="majorHAnsi"/>
@@ -9110,7 +9326,7 @@
           <w:delText xml:space="preserve">(i) thẩm định độc lập bổ sung </w:delText>
         </w:r>
       </w:del>
-      <w:del w:id="1094" w:author="Tiếp thu thẩm định lần 5, bản 1.3.13 (Claude)" w:date="2026-09-29T16:41:24Z">
+      <w:del w:id="1100" w:author="Tiếp thu thẩm định lần 5, bản 1.3.13 (Claude)" w:date="2026-09-29T18:33:54Z">
         <w:r>
           <w:rPr>
             <w:rFonts w:asciiTheme="majorHAnsi" w:hAnsiTheme="majorHAnsi" w:cstheme="majorHAnsi"/>
@@ -9123,7 +9339,7 @@
           <w:delText xml:space="preserve">(vòng 5) trên tệp plugin bản 1.3.12 để xác nhận</w:delText>
         </w:r>
       </w:del>
-      <w:del w:id="1095" w:author="Tiếp thu thẩm định lần 5, bản 1.3.13 (Claude)" w:date="2026-09-29T16:41:24Z">
+      <w:del w:id="1101" w:author="Tiếp thu thẩm định lần 5, bản 1.3.13 (Claude)" w:date="2026-09-29T18:33:54Z">
         <w:r>
           <w:rPr>
             <w:rFonts w:asciiTheme="majorHAnsi" w:hAnsiTheme="majorHAnsi" w:cstheme="majorHAnsi"/>
@@ -9136,7 +9352,7 @@
           <w:delText xml:space="preserve"> việc khắc phục (vòng 1 đến vòng 4 đã thực hiện, kết quả tại Mục 6)</w:delText>
         </w:r>
       </w:del>
-      <w:del w:id="1096" w:author="Tiếp thu thẩm định lần 5, bản 1.3.13 (Claude)" w:date="2026-09-29T16:41:24Z">
+      <w:del w:id="1102" w:author="Tiếp thu thẩm định lần 5, bản 1.3.13 (Claude)" w:date="2026-09-29T18:33:54Z">
         <w:r>
           <w:rPr>
             <w:rFonts w:asciiTheme="majorHAnsi" w:hAnsiTheme="majorHAnsi" w:cstheme="majorHAnsi"/>
@@ -9149,7 +9365,7 @@
           <w:delText xml:space="preserve">;</w:delText>
         </w:r>
       </w:del>
-      <w:ins w:id="1097" w:author="Tiếp thu thẩm định lần 5, bản 1.3.13 (Claude)" w:date="2026-09-29T16:41:24Z">
+      <w:ins w:id="1103" w:author="Tiếp thu thẩm định lần 5, bản 1.3.13 (Claude)" w:date="2026-09-29T18:33:54Z">
         <w:r>
           <w:rPr>
             <w:rFonts w:asciiTheme="majorHAnsi" w:hAnsiTheme="majorHAnsi" w:cstheme="majorHAnsi"/>
@@ -9173,7 +9389,7 @@
         </w:rPr>
         <w:t xml:space="preserve"> (ii) kiểm thử nghiệm thu trên Claude (trò chuyện) và Claude Cowork; (iii) kiểm kê, thu hồi phiên bản cũ ở cấp tổ chức; phân quyền chỉ đọc kho KTC-Database có biên bản; </w:t>
       </w:r>
-      <w:del w:id="1098" w:author="Tiếp thu thẩm định lần 5, bản 1.3.13 (Claude)" w:date="2026-09-29T16:41:24Z">
+      <w:del w:id="1104" w:author="Tiếp thu thẩm định lần 5, bản 1.3.13 (Claude)" w:date="2026-09-29T18:33:54Z">
         <w:r>
           <w:rPr>
             <w:rFonts w:asciiTheme="majorHAnsi" w:hAnsiTheme="majorHAnsi" w:cstheme="majorHAnsi"/>
@@ -9186,7 +9402,7 @@
           <w:delText xml:space="preserve">(iv) rà soát bằng Skill “ktc-ra-soat-897” phần sửa đổi lần 3 của dự thảo Thông báo, Tài liệu hướng dẫn (</w:delText>
         </w:r>
       </w:del>
-      <w:ins w:id="1099" w:author="Tiếp thu thẩm định lần 5, bản 1.3.13 (Claude)" w:date="2026-09-29T16:41:24Z">
+      <w:ins w:id="1105" w:author="Tiếp thu thẩm định lần 5, bản 1.3.13 (Claude)" w:date="2026-09-29T18:33:54Z">
         <w:r>
           <w:rPr>
             <w:rFonts w:asciiTheme="majorHAnsi" w:hAnsiTheme="majorHAnsi" w:cstheme="majorHAnsi"/>
@@ -9221,7 +9437,7 @@
         </w:rPr>
         <w:t xml:space="preserve">đã đối chiếu bản gốc ngày 27/9/2026; phần cập nhật ngày 28 - 29/9/2026 </w:t>
       </w:r>
-      <w:del w:id="1100" w:author="Tiếp thu thẩm định lần 5, bản 1.3.13 (Claude)" w:date="2026-09-29T16:41:24Z">
+      <w:del w:id="1106" w:author="Tiếp thu thẩm định lần 5, bản 1.3.13 (Claude)" w:date="2026-09-29T18:33:54Z">
         <w:r>
           <w:rPr>
             <w:rFonts w:asciiTheme="majorHAnsi" w:hAnsiTheme="majorHAnsi" w:cstheme="majorHAnsi"/>
@@ -9234,7 +9450,7 @@
           <w:delText xml:space="preserve">đã rà soát bổ sung (vòng 4) ngày 29/9/2026)</w:delText>
         </w:r>
       </w:del>
-      <w:del w:id="1101" w:author="Tiếp thu thẩm định lần 5, bản 1.3.13 (Claude)" w:date="2026-09-29T16:41:24Z">
+      <w:del w:id="1107" w:author="Tiếp thu thẩm định lần 5, bản 1.3.13 (Claude)" w:date="2026-09-29T18:33:54Z">
         <w:r>
           <w:rPr>
             <w:rFonts w:asciiTheme="majorHAnsi" w:hAnsiTheme="majorHAnsi" w:cstheme="majorHAnsi"/>
@@ -9247,7 +9463,7 @@
           <w:delText xml:space="preserve">.</w:delText>
         </w:r>
       </w:del>
-      <w:ins w:id="1102" w:author="Tiếp thu thẩm định lần 5, bản 1.3.13 (Claude)" w:date="2026-09-29T16:41:24Z">
+      <w:ins w:id="1108" w:author="Tiếp thu thẩm định lần 5, bản 1.3.13 (Claude)" w:date="2026-09-29T18:33:54Z">
         <w:r>
           <w:rPr>
             <w:rFonts w:asciiTheme="majorHAnsi" w:hAnsiTheme="majorHAnsi" w:cstheme="majorHAnsi"/>
@@ -9291,7 +9507,7 @@
         </w:rPr>
         <w:t xml:space="preserve">Phòng TH-HC&amp;QT đề xuất: sau khi hoàn thiện hồ sơ, Phòng QLKHCN&amp;HTPT thẩm định theo điểm c Mục 8 Thông báo số 1056/TB-CĐKT; Bộ công cụ được triển khai thí điểm ở chế độ người dùng tự cài trên Hệ thống Claude AI Team của Trường, </w:t>
       </w:r>
-      <w:del w:id="1103" w:author="Tiếp thu thẩm định lần 5, bản 1.3.13 (Claude)" w:date="2026-09-29T16:41:24Z">
+      <w:del w:id="1109" w:author="Tiếp thu thẩm định lần 5, bản 1.3.13 (Claude)" w:date="2026-09-29T18:33:54Z">
         <w:r>
           <w:rPr>
             <w:rFonts w:asciiTheme="majorHAnsi" w:hAnsiTheme="majorHAnsi" w:cstheme="majorHAnsi"/>
@@ -9301,7 +9517,7 @@
           <w:delText xml:space="preserve">sau nghiệm thu mới áp dụng rộng.</w:delText>
         </w:r>
       </w:del>
-      <w:ins w:id="1104" w:author="Tiếp thu thẩm định lần 5, bản 1.3.13 (Claude)" w:date="2026-09-29T16:41:24Z">
+      <w:ins w:id="1110" w:author="Tiếp thu thẩm định lần 5, bản 1.3.13 (Claude)" w:date="2026-09-29T18:33:54Z">
         <w:r>
           <w:rPr>
             <w:rFonts w:asciiTheme="majorHAnsi" w:hAnsiTheme="majorHAnsi" w:cstheme="majorHAnsi"/>

</xml_diff>